<commit_message>
Replace the English report with the version exported from Word
Co-Authored-By: Claude Opus 5.5 <noreply@anthropic.com>
Claude-Session: https://claude.ai/code/session_019XZkWzdpoSdRT1bmpVNWG3
</commit_message>
<xml_diff>
--- a/docs/report/KumaWatch_Patrol_final_report_en.docx
+++ b/docs/report/KumaWatch_Patrol_final_report_en.docx
@@ -8,12 +8,12 @@
       </w:pPr>
       <w:r>
         <w:rPr>
-          <w:rFonts w:ascii="Arial" w:eastAsia="游ゴシック" w:hAnsi="Arial"/>
+          <w:rFonts w:ascii="Arial" w:eastAsia="Yu Gothic" w:hAnsi="Arial"/>
           <w:color w:val="5B6570"/>
           <w:sz w:val="16"/>
           <w:szCs w:val="16"/>
         </w:rPr>
-        <w:t xml:space="preserve">Physical AI Applications 2026 — Final Assignment Report</w:t>
+        <w:t>Physical AI Applications 2026 — Final Assignment Report</w:t>
       </w:r>
     </w:p>
     <w:p>
@@ -22,7 +22,7 @@
         <w:spacing w:after="20"/>
       </w:pPr>
       <w:r>
-        <w:t xml:space="preserve">KumaWatch Patrol: An AI Robot That Patrols Bear-Sighting Risk</w:t>
+        <w:t>KumaWatch Patrol: An AI Robot That Patrols Bear-Sighting Risk</w:t>
       </w:r>
     </w:p>
     <w:p>
@@ -34,17 +34,17 @@
       </w:pPr>
       <w:r>
         <w:rPr>
-          <w:rFonts w:ascii="Arial" w:eastAsia="游ゴシック" w:hAnsi="Arial"/>
+          <w:rFonts w:ascii="Arial" w:eastAsia="Yu Gothic" w:hAnsi="Arial"/>
           <w:color w:val="5B6570"/>
           <w:sz w:val="20"/>
           <w:szCs w:val="20"/>
         </w:rPr>
-        <w:t xml:space="preserve">Risk-Aware Robotic Patrol for Bear Encounters</w:t>
+        <w:t>Risk-Aware Robotic Patrol for Bear Encounters</w:t>
       </w:r>
     </w:p>
     <w:tbl>
       <w:tblPr>
-        <w:tblW w:w="9978" w:type="dxa"/>
+        <w:tblW w:w="4989" w:type="dxa"/>
         <w:tblBorders>
           <w:top w:val="single" w:sz="4" w:space="0" w:color="auto"/>
           <w:left w:val="single" w:sz="4" w:space="0" w:color="auto"/>
@@ -63,8 +63,6 @@
       <w:tblGrid>
         <w:gridCol w:w="1300"/>
         <w:gridCol w:w="3689"/>
-        <w:gridCol w:w="1300"/>
-        <w:gridCol w:w="3689"/>
       </w:tblGrid>
       <w:tr>
         <w:tc>
@@ -87,14 +85,14 @@
           <w:p>
             <w:r>
               <w:rPr>
-                <w:rFonts w:ascii="Arial" w:eastAsia="游ゴシック" w:hAnsi="Arial"/>
+                <w:rFonts w:ascii="Arial" w:eastAsia="Yu Gothic" w:hAnsi="Arial"/>
                 <w:b/>
                 <w:bCs/>
                 <w:color w:val="5B6570"/>
                 <w:sz w:val="17"/>
                 <w:szCs w:val="17"/>
               </w:rPr>
-              <w:t xml:space="preserve">Author</w:t>
+              <w:t>Author</w:t>
             </w:r>
           </w:p>
         </w:tc>
@@ -124,7 +122,7 @@
             </w:pPr>
             <w:r>
               <w:rPr>
-                <w:rFonts w:ascii="Arial" w:eastAsia="游ゴシック" w:hAnsi="Arial" w:hint="eastAsia"/>
+                <w:rFonts w:ascii="Arial" w:eastAsia="Yu Gothic" w:hAnsi="Arial" w:hint="eastAsia"/>
                 <w:b/>
                 <w:bCs/>
                 <w:color w:val="000000" w:themeColor="text1"/>
@@ -135,192 +133,6 @@
             </w:r>
           </w:p>
         </w:tc>
-        <w:tc>
-          <w:tcPr>
-            <w:tcW w:w="1300" w:type="dxa"/>
-            <w:tcBorders>
-              <w:top w:val="single" w:sz="4" w:space="0" w:color="CFD6DD"/>
-              <w:left w:val="single" w:sz="4" w:space="0" w:color="CFD6DD"/>
-              <w:bottom w:val="single" w:sz="4" w:space="0" w:color="CFD6DD"/>
-              <w:right w:val="single" w:sz="4" w:space="0" w:color="CFD6DD"/>
-            </w:tcBorders>
-            <w:shd w:val="clear" w:color="auto" w:fill="F3F6F8"/>
-            <w:tcMar>
-              <w:top w:w="60" w:type="dxa"/>
-              <w:left w:w="90" w:type="dxa"/>
-              <w:bottom w:w="60" w:type="dxa"/>
-              <w:right w:w="90" w:type="dxa"/>
-            </w:tcMar>
-          </w:tcPr>
-          <w:p>
-            <w:r>
-              <w:rPr>
-                <w:rFonts w:ascii="Arial" w:eastAsia="游ゴシック" w:hAnsi="Arial"/>
-                <w:b/>
-                <w:bCs/>
-                <w:color w:val="5B6570"/>
-                <w:sz w:val="17"/>
-                <w:szCs w:val="17"/>
-              </w:rPr>
-              <w:t xml:space="preserve">Date</w:t>
-            </w:r>
-          </w:p>
-        </w:tc>
-        <w:tc>
-          <w:tcPr>
-            <w:tcW w:w="3689" w:type="dxa"/>
-            <w:tcBorders>
-              <w:top w:val="single" w:sz="4" w:space="0" w:color="CFD6DD"/>
-              <w:left w:val="single" w:sz="4" w:space="0" w:color="CFD6DD"/>
-              <w:bottom w:val="single" w:sz="4" w:space="0" w:color="CFD6DD"/>
-              <w:right w:val="single" w:sz="4" w:space="0" w:color="CFD6DD"/>
-            </w:tcBorders>
-            <w:tcMar>
-              <w:top w:w="60" w:type="dxa"/>
-              <w:left w:w="120" w:type="dxa"/>
-              <w:bottom w:w="60" w:type="dxa"/>
-              <w:right w:w="90" w:type="dxa"/>
-            </w:tcMar>
-          </w:tcPr>
-          <w:p>
-            <w:r>
-              <w:rPr>
-                <w:rFonts w:ascii="Arial" w:eastAsia="游ゴシック" w:hAnsi="Arial"/>
-                <w:color w:val="1D232A"/>
-                <w:sz w:val="18"/>
-                <w:szCs w:val="18"/>
-              </w:rPr>
-              <w:t xml:space="preserve">November 2026</w:t>
-            </w:r>
-          </w:p>
-        </w:tc>
-      </w:tr>
-      <w:tr>
-        <w:tc>
-          <w:tcPr>
-            <w:tcW w:w="1300" w:type="dxa"/>
-            <w:tcBorders>
-              <w:top w:val="single" w:sz="4" w:space="0" w:color="CFD6DD"/>
-              <w:left w:val="single" w:sz="4" w:space="0" w:color="CFD6DD"/>
-              <w:bottom w:val="single" w:sz="4" w:space="0" w:color="CFD6DD"/>
-              <w:right w:val="single" w:sz="4" w:space="0" w:color="CFD6DD"/>
-            </w:tcBorders>
-            <w:shd w:val="clear" w:color="auto" w:fill="F3F6F8"/>
-            <w:tcMar>
-              <w:top w:w="60" w:type="dxa"/>
-              <w:left w:w="90" w:type="dxa"/>
-              <w:bottom w:w="60" w:type="dxa"/>
-              <w:right w:w="90" w:type="dxa"/>
-            </w:tcMar>
-          </w:tcPr>
-          <w:p>
-            <w:r>
-              <w:rPr>
-                <w:rFonts w:ascii="Arial" w:eastAsia="游ゴシック" w:hAnsi="Arial"/>
-                <w:b/>
-                <w:bCs/>
-                <w:color w:val="5B6570"/>
-                <w:sz w:val="17"/>
-                <w:szCs w:val="17"/>
-              </w:rPr>
-              <w:t xml:space="preserve">Video URL</w:t>
-            </w:r>
-          </w:p>
-        </w:tc>
-        <w:tc>
-          <w:tcPr>
-            <w:tcW w:w="3689" w:type="dxa"/>
-            <w:tcBorders>
-              <w:top w:val="single" w:sz="4" w:space="0" w:color="CFD6DD"/>
-              <w:left w:val="single" w:sz="4" w:space="0" w:color="CFD6DD"/>
-              <w:bottom w:val="single" w:sz="4" w:space="0" w:color="CFD6DD"/>
-              <w:right w:val="single" w:sz="4" w:space="0" w:color="CFD6DD"/>
-            </w:tcBorders>
-            <w:tcMar>
-              <w:top w:w="60" w:type="dxa"/>
-              <w:left w:w="120" w:type="dxa"/>
-              <w:bottom w:w="60" w:type="dxa"/>
-              <w:right w:w="90" w:type="dxa"/>
-            </w:tcMar>
-          </w:tcPr>
-          <w:p>
-            <w:pPr>
-              <w:rPr>
-                <w:color w:val="000000" w:themeColor="text1"/>
-                <w:sz w:val="16"/>
-                <w:szCs w:val="16"/>
-              </w:rPr>
-            </w:pPr>
-            <w:r>
-              <w:rPr>
-                <w:rFonts w:ascii="Arial" w:eastAsia="游ゴシック" w:hAnsi="Arial"/>
-                <w:color w:val="000000" w:themeColor="text1"/>
-                <w:sz w:val="16"/>
-                <w:szCs w:val="16"/>
-              </w:rPr>
-              <w:t>https://www.youtube.com/watch?v=t66S8h_LumE</w:t>
-            </w:r>
-          </w:p>
-        </w:tc>
-        <w:tc>
-          <w:tcPr>
-            <w:tcW w:w="1300" w:type="dxa"/>
-            <w:tcBorders>
-              <w:top w:val="single" w:sz="4" w:space="0" w:color="CFD6DD"/>
-              <w:left w:val="single" w:sz="4" w:space="0" w:color="CFD6DD"/>
-              <w:bottom w:val="single" w:sz="4" w:space="0" w:color="CFD6DD"/>
-              <w:right w:val="single" w:sz="4" w:space="0" w:color="CFD6DD"/>
-            </w:tcBorders>
-            <w:shd w:val="clear" w:color="auto" w:fill="F3F6F8"/>
-            <w:tcMar>
-              <w:top w:w="60" w:type="dxa"/>
-              <w:left w:w="90" w:type="dxa"/>
-              <w:bottom w:w="60" w:type="dxa"/>
-              <w:right w:w="90" w:type="dxa"/>
-            </w:tcMar>
-          </w:tcPr>
-          <w:p>
-            <w:r>
-              <w:rPr>
-                <w:rFonts w:ascii="Arial" w:eastAsia="游ゴシック" w:hAnsi="Arial"/>
-                <w:b/>
-                <w:bCs/>
-                <w:color w:val="5B6570"/>
-                <w:sz w:val="17"/>
-                <w:szCs w:val="17"/>
-              </w:rPr>
-              <w:t xml:space="preserve">Code</w:t>
-            </w:r>
-          </w:p>
-        </w:tc>
-        <w:tc>
-          <w:tcPr>
-            <w:tcW w:w="3689" w:type="dxa"/>
-            <w:tcBorders>
-              <w:top w:val="single" w:sz="4" w:space="0" w:color="CFD6DD"/>
-              <w:left w:val="single" w:sz="4" w:space="0" w:color="CFD6DD"/>
-              <w:bottom w:val="single" w:sz="4" w:space="0" w:color="CFD6DD"/>
-              <w:right w:val="single" w:sz="4" w:space="0" w:color="CFD6DD"/>
-            </w:tcBorders>
-            <w:tcMar>
-              <w:top w:w="60" w:type="dxa"/>
-              <w:left w:w="120" w:type="dxa"/>
-              <w:bottom w:w="60" w:type="dxa"/>
-              <w:right w:w="90" w:type="dxa"/>
-            </w:tcMar>
-          </w:tcPr>
-          <w:p>
-            <w:r>
-              <w:rPr>
-                <w:rFonts w:ascii="Arial" w:eastAsia="游ゴシック" w:hAnsi="Arial"/>
-                <w:color w:val="1D232A"/>
-                <w:sz w:val="18"/>
-                <w:szCs w:val="18"/>
-              </w:rPr>
-              <w:t>github.com/todalaba/KumaWatch-Patrol</w:t>
-            </w:r>
-          </w:p>
-        </w:tc>
       </w:tr>
     </w:tbl>
     <w:p>
@@ -351,7 +163,7 @@
           <w:i/>
           <w:iCs/>
         </w:rPr>
-        <w:t xml:space="preserve">K</w:t>
+        <w:t>K</w:t>
       </w:r>
       <w:r>
         <w:t xml:space="preserve"> cells with the highest sighting risk for the next day. A forecast, however, is only a number on a map; checking the site and acting safely if a bear is there is still left to people. This work makes that step, from forecast to on-site check, concrete with a robot.</w:t>
@@ -367,14 +179,14 @@
         <w:spacing w:after="40" w:line="320" w:lineRule="auto"/>
       </w:pPr>
       <w:r>
-        <w:t xml:space="preserve">Based on the AI’s sighting-risk forecast, automatically choose as many sites as can be patrolled (</w:t>
+        <w:t>Based on the AI’s sighting-risk forecast, automatically choose as many sites as can be patrolled (</w:t>
       </w:r>
       <w:r>
         <w:rPr>
           <w:i/>
           <w:iCs/>
         </w:rPr>
-        <w:t xml:space="preserve">K</w:t>
+        <w:t>K</w:t>
       </w:r>
       <w:r>
         <w:t xml:space="preserve"> = 3) and the order in which to visit them.</w:t>
@@ -390,7 +202,7 @@
         <w:spacing w:after="40" w:line="320" w:lineRule="auto"/>
       </w:pPr>
       <w:r>
-        <w:t xml:space="preserve">Patrol the candidate sites autonomously with Navigation2, and find bears by checking camera images with AI.</w:t>
+        <w:t>Patrol the candidate sites autonomously with Navigation2, and find bears by checking camera images with AI.</w:t>
       </w:r>
     </w:p>
     <w:p>
@@ -416,7 +228,7 @@
         <w:spacing w:after="40" w:line="320" w:lineRule="auto"/>
       </w:pPr>
       <w:r>
-        <w:t xml:space="preserve">Compare with a fixed-route patrol under the same conditions to show the effect of choosing sites with AI.</w:t>
+        <w:t>Compare with a fixed-route patrol under the same conditions to show the effect of choosing sites with AI.</w:t>
       </w:r>
     </w:p>
     <w:p>
@@ -499,7 +311,7 @@
       </w:pPr>
       <w:r>
         <w:rPr>
-          <w:rFonts w:ascii="Arial" w:eastAsia="游ゴシック" w:hAnsi="Arial"/>
+          <w:rFonts w:ascii="Arial" w:eastAsia="Yu Gothic" w:hAnsi="Arial"/>
           <w:b/>
           <w:bCs/>
           <w:sz w:val="16"/>
@@ -509,12 +321,12 @@
       </w:r>
       <w:r>
         <w:rPr>
-          <w:rFonts w:ascii="Arial" w:eastAsia="游ゴシック" w:hAnsi="Arial"/>
+          <w:rFonts w:ascii="Arial" w:eastAsia="Yu Gothic" w:hAnsi="Arial"/>
           <w:color w:val="5B6570"/>
           <w:sz w:val="16"/>
           <w:szCs w:val="16"/>
         </w:rPr>
-        <w:t xml:space="preserve">Orange boxes are the parts that use AI. Nodes are connected by ROS 2 topics (custom messages for risk and bear detection) and the Nav2 NavigateToPose action.</w:t>
+        <w:t>Orange boxes are the parts that use AI. Nodes are connected by ROS 2 topics (custom messages for risk and bear detection) and the Nav2 NavigateToPose action.</w:t>
       </w:r>
     </w:p>
     <w:p>
@@ -523,7 +335,7 @@
         <w:jc w:val="both"/>
       </w:pPr>
       <w:r>
-        <w:t xml:space="preserve">Sites are chosen by a utility that considers not only risk but also social importance and travel cost.</w:t>
+        <w:t>Sites are chosen by a utility that considers not only risk but also social importance and travel cost.</w:t>
       </w:r>
     </w:p>
     <w:p>
@@ -538,7 +350,7 @@
           <w:sz w:val="22"/>
           <w:szCs w:val="22"/>
         </w:rPr>
-        <w:t xml:space="preserve">U</w:t>
+        <w:t>U</w:t>
       </w:r>
       <w:r>
         <w:rPr>
@@ -548,7 +360,7 @@
           <w:szCs w:val="22"/>
           <w:vertAlign w:val="subscript"/>
         </w:rPr>
-        <w:t xml:space="preserve">i</w:t>
+        <w:t>i</w:t>
       </w:r>
       <w:r>
         <w:rPr>
@@ -564,7 +376,7 @@
           <w:sz w:val="22"/>
           <w:szCs w:val="22"/>
         </w:rPr>
-        <w:t xml:space="preserve">w</w:t>
+        <w:t>w</w:t>
       </w:r>
       <w:r>
         <w:rPr>
@@ -574,7 +386,7 @@
           <w:szCs w:val="22"/>
           <w:vertAlign w:val="subscript"/>
         </w:rPr>
-        <w:t xml:space="preserve">i</w:t>
+        <w:t>i</w:t>
       </w:r>
       <w:r>
         <w:rPr>
@@ -590,7 +402,7 @@
           <w:sz w:val="22"/>
           <w:szCs w:val="22"/>
         </w:rPr>
-        <w:t xml:space="preserve">p</w:t>
+        <w:t>p</w:t>
       </w:r>
       <w:r>
         <w:rPr>
@@ -600,7 +412,7 @@
           <w:szCs w:val="22"/>
           <w:vertAlign w:val="subscript"/>
         </w:rPr>
-        <w:t xml:space="preserve">i</w:t>
+        <w:t>i</w:t>
       </w:r>
       <w:r>
         <w:rPr>
@@ -616,7 +428,7 @@
           <w:sz w:val="22"/>
           <w:szCs w:val="22"/>
         </w:rPr>
-        <w:t xml:space="preserve">λ</w:t>
+        <w:t>λ</w:t>
       </w:r>
       <w:r>
         <w:rPr>
@@ -632,7 +444,7 @@
           <w:sz w:val="22"/>
           <w:szCs w:val="22"/>
         </w:rPr>
-        <w:t xml:space="preserve">d</w:t>
+        <w:t>d</w:t>
       </w:r>
       <w:r>
         <w:rPr>
@@ -642,7 +454,7 @@
           <w:szCs w:val="22"/>
           <w:vertAlign w:val="subscript"/>
         </w:rPr>
-        <w:t xml:space="preserve">i</w:t>
+        <w:t>i</w:t>
       </w:r>
     </w:p>
     <w:p>
@@ -655,7 +467,7 @@
           <w:i/>
           <w:iCs/>
         </w:rPr>
-        <w:t xml:space="preserve">p</w:t>
+        <w:t>p</w:t>
       </w:r>
       <w:r>
         <w:rPr>
@@ -663,7 +475,7 @@
           <w:iCs/>
           <w:vertAlign w:val="subscript"/>
         </w:rPr>
-        <w:t xml:space="preserve">i</w:t>
+        <w:t>i</w:t>
       </w:r>
       <w:r>
         <w:t xml:space="preserve"> is the risk, </w:t>
@@ -673,7 +485,7 @@
           <w:i/>
           <w:iCs/>
         </w:rPr>
-        <w:t xml:space="preserve">w</w:t>
+        <w:t>w</w:t>
       </w:r>
       <w:r>
         <w:rPr>
@@ -681,7 +493,7 @@
           <w:iCs/>
           <w:vertAlign w:val="subscript"/>
         </w:rPr>
-        <w:t xml:space="preserve">i</w:t>
+        <w:t>i</w:t>
       </w:r>
       <w:r>
         <w:t xml:space="preserve"> the importance (school route 1.2, residential 1.1, others 1.0), </w:t>
@@ -691,7 +503,7 @@
           <w:i/>
           <w:iCs/>
         </w:rPr>
-        <w:t xml:space="preserve">d</w:t>
+        <w:t>d</w:t>
       </w:r>
       <w:r>
         <w:rPr>
@@ -699,7 +511,7 @@
           <w:iCs/>
           <w:vertAlign w:val="subscript"/>
         </w:rPr>
-        <w:t xml:space="preserve">i</w:t>
+        <w:t>i</w:t>
       </w:r>
       <w:r>
         <w:t xml:space="preserve"> the distance from the base [m], and </w:t>
@@ -709,7 +521,7 @@
           <w:i/>
           <w:iCs/>
         </w:rPr>
-        <w:t xml:space="preserve">λ</w:t>
+        <w:t>λ</w:t>
       </w:r>
       <w:r>
         <w:t xml:space="preserve"> = 0.02. The top 3 sites by </w:t>
@@ -719,7 +531,7 @@
           <w:i/>
           <w:iCs/>
         </w:rPr>
-        <w:t xml:space="preserve">U</w:t>
+        <w:t>U</w:t>
       </w:r>
       <w:r>
         <w:rPr>
@@ -727,10 +539,14 @@
           <w:iCs/>
           <w:vertAlign w:val="subscript"/>
         </w:rPr>
-        <w:t xml:space="preserve">i</w:t>
-      </w:r>
-      <w:r>
-        <w:t xml:space="preserve"> are selected, and the order that minimises the total distance of the round trip from the base is found over all permutations. In this case the route is P2 (forest edge) → P4 (garbage point) → P3 (school route). For comparison, risk-only selection and a fixed route are also implemented.</w:t>
+        <w:t>i</w:t>
+      </w:r>
+      <w:r>
+        <w:t xml:space="preserve"> are selected, and the order that minimises the total distance of the round trip from the base is found over all permutations. </w:t>
+      </w:r>
+      <w:r>
+        <w:lastRenderedPageBreak/>
+        <w:t>In this case the route is P2 (forest edge) → P4 (garbage point) → P3 (school route). For comparison, risk-only selection and a fixed route are also implemented.</w:t>
       </w:r>
     </w:p>
     <w:p>
@@ -740,7 +556,7 @@
       </w:pPr>
       <w:r>
         <w:rPr>
-          <w:rFonts w:ascii="Consolas" w:eastAsia="游ゴシック" w:hAnsi="Consolas"/>
+          <w:rFonts w:ascii="Consolas" w:eastAsia="Yu Gothic" w:hAnsi="Consolas"/>
           <w:sz w:val="17"/>
           <w:szCs w:val="17"/>
         </w:rPr>
@@ -791,7 +607,16 @@
         <w:t>IBM Granite TinyTimeMixer (TTM 1536-96-R2) [1]</w:t>
       </w:r>
       <w:r>
-        <w:t xml:space="preserve"> precomputed in KumaWatch (only the values for the 5 sites are included). TTM is a foundation model for time-series forecasting pre-trained on a large number of time series; KumaWatch uses it to forecast, zero-shot, the sightings on every day of 2025 (not used for training) from the history of daily sighting counts in 144 cells of Yamagata Prefecture. The town in this work is fictional, but the risks of the 5 sites are forecasts for real cells (Table 2). They were assigned by the following rule: the 2 cells with an actual sighting on 7 June 2025 become P2 and P4, and bears are placed there in Gazebo as well. From the cells without a sighting we chose the one ranked highest by TTM (P3, an AI false alarm), one around 40th (P5) and one around 100th (P1). Risk is the cell’s rank among the 144 cells of the prefecture, expressed as a percentile.</w:t>
+        <w:t xml:space="preserve"> precomputed in KumaWatch (only the values for the 5 sites are included). TTM is a foundation model for time-series forecasting pre-trained on a large number of time series; KumaWatch uses it to forecast, zero-shot, the sightings on every day of 2025 (not used for training) from the history of daily sighting counts in 144 cells of Yamagata Prefecture. The town in this work is fictional, but the risks of the 5 sites are forecasts for real cells (Table </w:t>
+      </w:r>
+      <w:r>
+        <w:rPr>
+          <w:rFonts w:hint="eastAsia"/>
+        </w:rPr>
+        <w:t>1</w:t>
+      </w:r>
+      <w:r>
+        <w:t>). They were assigned by the following rule: the 2 cells with an actual sighting on 7 June 2025 become P2 and P4, and bears are placed there in Gazebo as well. From the cells without a sighting we chose the one ranked highest by TTM (P3, an AI false alarm), one around 40th (P5) and one around 100th (P1). Risk is the cell’s rank among the 144 cells of the prefecture, expressed as a percentile.</w:t>
       </w:r>
     </w:p>
     <w:tbl>
@@ -847,13 +672,13 @@
             </w:pPr>
             <w:r>
               <w:rPr>
-                <w:rFonts w:ascii="Arial" w:eastAsia="游ゴシック" w:hAnsi="Arial"/>
+                <w:rFonts w:ascii="Arial" w:eastAsia="Yu Gothic" w:hAnsi="Arial"/>
                 <w:b/>
                 <w:bCs/>
                 <w:sz w:val="16"/>
                 <w:szCs w:val="16"/>
               </w:rPr>
-              <w:t xml:space="preserve">Site</w:t>
+              <w:t>Site</w:t>
             </w:r>
           </w:p>
         </w:tc>
@@ -879,13 +704,13 @@
             </w:pPr>
             <w:r>
               <w:rPr>
-                <w:rFonts w:ascii="Arial" w:eastAsia="游ゴシック" w:hAnsi="Arial"/>
+                <w:rFonts w:ascii="Arial" w:eastAsia="Yu Gothic" w:hAnsi="Arial"/>
                 <w:b/>
                 <w:bCs/>
                 <w:sz w:val="16"/>
                 <w:szCs w:val="16"/>
               </w:rPr>
-              <w:t xml:space="preserve">Setting</w:t>
+              <w:t>Setting</w:t>
             </w:r>
           </w:p>
         </w:tc>
@@ -911,13 +736,13 @@
             </w:pPr>
             <w:r>
               <w:rPr>
-                <w:rFonts w:ascii="Arial" w:eastAsia="游ゴシック" w:hAnsi="Arial"/>
+                <w:rFonts w:ascii="Arial" w:eastAsia="Yu Gothic" w:hAnsi="Arial"/>
                 <w:b/>
                 <w:bCs/>
                 <w:sz w:val="16"/>
                 <w:szCs w:val="16"/>
               </w:rPr>
-              <w:t xml:space="preserve">Cell</w:t>
+              <w:t>Cell</w:t>
             </w:r>
           </w:p>
         </w:tc>
@@ -944,13 +769,13 @@
             </w:pPr>
             <w:r>
               <w:rPr>
-                <w:rFonts w:ascii="Arial" w:eastAsia="游ゴシック" w:hAnsi="Arial"/>
+                <w:rFonts w:ascii="Arial" w:eastAsia="Yu Gothic" w:hAnsi="Arial"/>
                 <w:b/>
                 <w:bCs/>
                 <w:sz w:val="16"/>
                 <w:szCs w:val="16"/>
               </w:rPr>
-              <w:t xml:space="preserve">TTM rank</w:t>
+              <w:t>TTM rank</w:t>
             </w:r>
           </w:p>
         </w:tc>
@@ -977,13 +802,13 @@
             </w:pPr>
             <w:r>
               <w:rPr>
-                <w:rFonts w:ascii="Arial" w:eastAsia="游ゴシック" w:hAnsi="Arial"/>
+                <w:rFonts w:ascii="Arial" w:eastAsia="Yu Gothic" w:hAnsi="Arial"/>
                 <w:b/>
                 <w:bCs/>
                 <w:sz w:val="16"/>
                 <w:szCs w:val="16"/>
               </w:rPr>
-              <w:t xml:space="preserve">Risk</w:t>
+              <w:t>Risk</w:t>
             </w:r>
           </w:p>
         </w:tc>
@@ -1009,13 +834,13 @@
             </w:pPr>
             <w:r>
               <w:rPr>
-                <w:rFonts w:ascii="Arial" w:eastAsia="游ゴシック" w:hAnsi="Arial"/>
+                <w:rFonts w:ascii="Arial" w:eastAsia="Yu Gothic" w:hAnsi="Arial"/>
                 <w:b/>
                 <w:bCs/>
                 <w:sz w:val="16"/>
                 <w:szCs w:val="16"/>
               </w:rPr>
-              <w:t xml:space="preserve">Actual sighting</w:t>
+              <w:t>Actual sighting</w:t>
             </w:r>
           </w:p>
         </w:tc>
@@ -1041,13 +866,13 @@
             </w:pPr>
             <w:r>
               <w:rPr>
-                <w:rFonts w:ascii="Arial" w:eastAsia="游ゴシック" w:hAnsi="Arial"/>
+                <w:rFonts w:ascii="Arial" w:eastAsia="Yu Gothic" w:hAnsi="Arial"/>
                 <w:b/>
                 <w:bCs/>
                 <w:sz w:val="16"/>
                 <w:szCs w:val="16"/>
               </w:rPr>
-              <w:t xml:space="preserve">Bear in Gazebo</w:t>
+              <w:t>Bear in Gazebo</w:t>
             </w:r>
           </w:p>
         </w:tc>
@@ -1079,7 +904,7 @@
             </w:pPr>
             <w:r>
               <w:rPr>
-                <w:rFonts w:ascii="Arial" w:eastAsia="游ゴシック" w:hAnsi="Arial"/>
+                <w:rFonts w:ascii="Arial" w:eastAsia="Yu Gothic" w:hAnsi="Arial"/>
                 <w:sz w:val="16"/>
                 <w:szCs w:val="16"/>
               </w:rPr>
@@ -1110,11 +935,11 @@
             </w:pPr>
             <w:r>
               <w:rPr>
-                <w:rFonts w:ascii="Arial" w:eastAsia="游ゴシック" w:hAnsi="Arial"/>
-                <w:sz w:val="16"/>
-                <w:szCs w:val="16"/>
-              </w:rPr>
-              <w:t xml:space="preserve">Garbage point</w:t>
+                <w:rFonts w:ascii="Arial" w:eastAsia="Yu Gothic" w:hAnsi="Arial"/>
+                <w:sz w:val="16"/>
+                <w:szCs w:val="16"/>
+              </w:rPr>
+              <w:t>Garbage point</w:t>
             </w:r>
           </w:p>
         </w:tc>
@@ -1141,7 +966,7 @@
             </w:pPr>
             <w:r>
               <w:rPr>
-                <w:rFonts w:ascii="Arial" w:eastAsia="游ゴシック" w:hAnsi="Arial"/>
+                <w:rFonts w:ascii="Arial" w:eastAsia="Yu Gothic" w:hAnsi="Arial"/>
                 <w:sz w:val="16"/>
                 <w:szCs w:val="16"/>
               </w:rPr>
@@ -1173,7 +998,7 @@
             </w:pPr>
             <w:r>
               <w:rPr>
-                <w:rFonts w:ascii="Arial" w:eastAsia="游ゴシック" w:hAnsi="Arial"/>
+                <w:rFonts w:ascii="Arial" w:eastAsia="Yu Gothic" w:hAnsi="Arial"/>
                 <w:sz w:val="16"/>
                 <w:szCs w:val="16"/>
               </w:rPr>
@@ -1205,7 +1030,7 @@
             </w:pPr>
             <w:r>
               <w:rPr>
-                <w:rFonts w:ascii="Arial" w:eastAsia="游ゴシック" w:hAnsi="Arial"/>
+                <w:rFonts w:ascii="Arial" w:eastAsia="Yu Gothic" w:hAnsi="Arial"/>
                 <w:sz w:val="16"/>
                 <w:szCs w:val="16"/>
               </w:rPr>
@@ -1236,11 +1061,11 @@
             </w:pPr>
             <w:r>
               <w:rPr>
-                <w:rFonts w:ascii="Arial" w:eastAsia="游ゴシック" w:hAnsi="Arial"/>
-                <w:sz w:val="16"/>
-                <w:szCs w:val="16"/>
-              </w:rPr>
-              <w:t xml:space="preserve">Yes</w:t>
+                <w:rFonts w:ascii="Arial" w:eastAsia="Yu Gothic" w:hAnsi="Arial"/>
+                <w:sz w:val="16"/>
+                <w:szCs w:val="16"/>
+              </w:rPr>
+              <w:t>Yes</w:t>
             </w:r>
           </w:p>
         </w:tc>
@@ -1267,11 +1092,11 @@
             </w:pPr>
             <w:r>
               <w:rPr>
-                <w:rFonts w:ascii="Arial" w:eastAsia="游ゴシック" w:hAnsi="Arial"/>
-                <w:sz w:val="16"/>
-                <w:szCs w:val="16"/>
-              </w:rPr>
-              <w:t xml:space="preserve">Yes</w:t>
+                <w:rFonts w:ascii="Arial" w:eastAsia="Yu Gothic" w:hAnsi="Arial"/>
+                <w:sz w:val="16"/>
+                <w:szCs w:val="16"/>
+              </w:rPr>
+              <w:t>Yes</w:t>
             </w:r>
           </w:p>
         </w:tc>
@@ -1302,7 +1127,7 @@
             </w:pPr>
             <w:r>
               <w:rPr>
-                <w:rFonts w:ascii="Arial" w:eastAsia="游ゴシック" w:hAnsi="Arial"/>
+                <w:rFonts w:ascii="Arial" w:eastAsia="Yu Gothic" w:hAnsi="Arial"/>
                 <w:sz w:val="16"/>
                 <w:szCs w:val="16"/>
               </w:rPr>
@@ -1332,11 +1157,11 @@
             </w:pPr>
             <w:r>
               <w:rPr>
-                <w:rFonts w:ascii="Arial" w:eastAsia="游ゴシック" w:hAnsi="Arial"/>
-                <w:sz w:val="16"/>
-                <w:szCs w:val="16"/>
-              </w:rPr>
-              <w:t xml:space="preserve">School route</w:t>
+                <w:rFonts w:ascii="Arial" w:eastAsia="Yu Gothic" w:hAnsi="Arial"/>
+                <w:sz w:val="16"/>
+                <w:szCs w:val="16"/>
+              </w:rPr>
+              <w:t>School route</w:t>
             </w:r>
           </w:p>
         </w:tc>
@@ -1362,7 +1187,7 @@
             </w:pPr>
             <w:r>
               <w:rPr>
-                <w:rFonts w:ascii="Arial" w:eastAsia="游ゴシック" w:hAnsi="Arial"/>
+                <w:rFonts w:ascii="Arial" w:eastAsia="Yu Gothic" w:hAnsi="Arial"/>
                 <w:sz w:val="16"/>
                 <w:szCs w:val="16"/>
               </w:rPr>
@@ -1393,7 +1218,7 @@
             </w:pPr>
             <w:r>
               <w:rPr>
-                <w:rFonts w:ascii="Arial" w:eastAsia="游ゴシック" w:hAnsi="Arial"/>
+                <w:rFonts w:ascii="Arial" w:eastAsia="Yu Gothic" w:hAnsi="Arial"/>
                 <w:sz w:val="16"/>
                 <w:szCs w:val="16"/>
               </w:rPr>
@@ -1424,7 +1249,7 @@
             </w:pPr>
             <w:r>
               <w:rPr>
-                <w:rFonts w:ascii="Arial" w:eastAsia="游ゴシック" w:hAnsi="Arial"/>
+                <w:rFonts w:ascii="Arial" w:eastAsia="Yu Gothic" w:hAnsi="Arial"/>
                 <w:sz w:val="16"/>
                 <w:szCs w:val="16"/>
               </w:rPr>
@@ -1454,11 +1279,11 @@
             </w:pPr>
             <w:r>
               <w:rPr>
-                <w:rFonts w:ascii="Arial" w:eastAsia="游ゴシック" w:hAnsi="Arial"/>
-                <w:sz w:val="16"/>
-                <w:szCs w:val="16"/>
-              </w:rPr>
-              <w:t xml:space="preserve">No (false alarm)</w:t>
+                <w:rFonts w:ascii="Arial" w:eastAsia="Yu Gothic" w:hAnsi="Arial"/>
+                <w:sz w:val="16"/>
+                <w:szCs w:val="16"/>
+              </w:rPr>
+              <w:t>No (false alarm)</w:t>
             </w:r>
           </w:p>
         </w:tc>
@@ -1484,11 +1309,11 @@
             </w:pPr>
             <w:r>
               <w:rPr>
-                <w:rFonts w:ascii="Arial" w:eastAsia="游ゴシック" w:hAnsi="Arial"/>
-                <w:sz w:val="16"/>
-                <w:szCs w:val="16"/>
-              </w:rPr>
-              <w:t xml:space="preserve">No</w:t>
+                <w:rFonts w:ascii="Arial" w:eastAsia="Yu Gothic" w:hAnsi="Arial"/>
+                <w:sz w:val="16"/>
+                <w:szCs w:val="16"/>
+              </w:rPr>
+              <w:t>No</w:t>
             </w:r>
           </w:p>
         </w:tc>
@@ -1520,7 +1345,7 @@
             </w:pPr>
             <w:r>
               <w:rPr>
-                <w:rFonts w:ascii="Arial" w:eastAsia="游ゴシック" w:hAnsi="Arial"/>
+                <w:rFonts w:ascii="Arial" w:eastAsia="Yu Gothic" w:hAnsi="Arial"/>
                 <w:sz w:val="16"/>
                 <w:szCs w:val="16"/>
               </w:rPr>
@@ -1551,11 +1376,11 @@
             </w:pPr>
             <w:r>
               <w:rPr>
-                <w:rFonts w:ascii="Arial" w:eastAsia="游ゴシック" w:hAnsi="Arial"/>
-                <w:sz w:val="16"/>
-                <w:szCs w:val="16"/>
-              </w:rPr>
-              <w:t xml:space="preserve">Forest edge</w:t>
+                <w:rFonts w:ascii="Arial" w:eastAsia="Yu Gothic" w:hAnsi="Arial"/>
+                <w:sz w:val="16"/>
+                <w:szCs w:val="16"/>
+              </w:rPr>
+              <w:t>Forest edge</w:t>
             </w:r>
           </w:p>
         </w:tc>
@@ -1582,7 +1407,7 @@
             </w:pPr>
             <w:r>
               <w:rPr>
-                <w:rFonts w:ascii="Arial" w:eastAsia="游ゴシック" w:hAnsi="Arial"/>
+                <w:rFonts w:ascii="Arial" w:eastAsia="Yu Gothic" w:hAnsi="Arial"/>
                 <w:sz w:val="16"/>
                 <w:szCs w:val="16"/>
               </w:rPr>
@@ -1614,7 +1439,7 @@
             </w:pPr>
             <w:r>
               <w:rPr>
-                <w:rFonts w:ascii="Arial" w:eastAsia="游ゴシック" w:hAnsi="Arial"/>
+                <w:rFonts w:ascii="Arial" w:eastAsia="Yu Gothic" w:hAnsi="Arial"/>
                 <w:sz w:val="16"/>
                 <w:szCs w:val="16"/>
               </w:rPr>
@@ -1646,7 +1471,7 @@
             </w:pPr>
             <w:r>
               <w:rPr>
-                <w:rFonts w:ascii="Arial" w:eastAsia="游ゴシック" w:hAnsi="Arial"/>
+                <w:rFonts w:ascii="Arial" w:eastAsia="Yu Gothic" w:hAnsi="Arial"/>
                 <w:sz w:val="16"/>
                 <w:szCs w:val="16"/>
               </w:rPr>
@@ -1677,11 +1502,11 @@
             </w:pPr>
             <w:r>
               <w:rPr>
-                <w:rFonts w:ascii="Arial" w:eastAsia="游ゴシック" w:hAnsi="Arial"/>
-                <w:sz w:val="16"/>
-                <w:szCs w:val="16"/>
-              </w:rPr>
-              <w:t xml:space="preserve">Yes</w:t>
+                <w:rFonts w:ascii="Arial" w:eastAsia="Yu Gothic" w:hAnsi="Arial"/>
+                <w:sz w:val="16"/>
+                <w:szCs w:val="16"/>
+              </w:rPr>
+              <w:t>Yes</w:t>
             </w:r>
           </w:p>
         </w:tc>
@@ -1708,11 +1533,11 @@
             </w:pPr>
             <w:r>
               <w:rPr>
-                <w:rFonts w:ascii="Arial" w:eastAsia="游ゴシック" w:hAnsi="Arial"/>
-                <w:sz w:val="16"/>
-                <w:szCs w:val="16"/>
-              </w:rPr>
-              <w:t xml:space="preserve">Yes</w:t>
+                <w:rFonts w:ascii="Arial" w:eastAsia="Yu Gothic" w:hAnsi="Arial"/>
+                <w:sz w:val="16"/>
+                <w:szCs w:val="16"/>
+              </w:rPr>
+              <w:t>Yes</w:t>
             </w:r>
           </w:p>
         </w:tc>
@@ -1743,7 +1568,7 @@
             </w:pPr>
             <w:r>
               <w:rPr>
-                <w:rFonts w:ascii="Arial" w:eastAsia="游ゴシック" w:hAnsi="Arial"/>
+                <w:rFonts w:ascii="Arial" w:eastAsia="Yu Gothic" w:hAnsi="Arial"/>
                 <w:sz w:val="16"/>
                 <w:szCs w:val="16"/>
               </w:rPr>
@@ -1773,11 +1598,11 @@
             </w:pPr>
             <w:r>
               <w:rPr>
-                <w:rFonts w:ascii="Arial" w:eastAsia="游ゴシック" w:hAnsi="Arial"/>
-                <w:sz w:val="16"/>
-                <w:szCs w:val="16"/>
-              </w:rPr>
-              <w:t xml:space="preserve">Riverside</w:t>
+                <w:rFonts w:ascii="Arial" w:eastAsia="Yu Gothic" w:hAnsi="Arial"/>
+                <w:sz w:val="16"/>
+                <w:szCs w:val="16"/>
+              </w:rPr>
+              <w:t>Riverside</w:t>
             </w:r>
           </w:p>
         </w:tc>
@@ -1803,7 +1628,7 @@
             </w:pPr>
             <w:r>
               <w:rPr>
-                <w:rFonts w:ascii="Arial" w:eastAsia="游ゴシック" w:hAnsi="Arial"/>
+                <w:rFonts w:ascii="Arial" w:eastAsia="Yu Gothic" w:hAnsi="Arial"/>
                 <w:sz w:val="16"/>
                 <w:szCs w:val="16"/>
               </w:rPr>
@@ -1834,7 +1659,7 @@
             </w:pPr>
             <w:r>
               <w:rPr>
-                <w:rFonts w:ascii="Arial" w:eastAsia="游ゴシック" w:hAnsi="Arial"/>
+                <w:rFonts w:ascii="Arial" w:eastAsia="Yu Gothic" w:hAnsi="Arial"/>
                 <w:sz w:val="16"/>
                 <w:szCs w:val="16"/>
               </w:rPr>
@@ -1865,7 +1690,7 @@
             </w:pPr>
             <w:r>
               <w:rPr>
-                <w:rFonts w:ascii="Arial" w:eastAsia="游ゴシック" w:hAnsi="Arial"/>
+                <w:rFonts w:ascii="Arial" w:eastAsia="Yu Gothic" w:hAnsi="Arial"/>
                 <w:sz w:val="16"/>
                 <w:szCs w:val="16"/>
               </w:rPr>
@@ -1895,11 +1720,11 @@
             </w:pPr>
             <w:r>
               <w:rPr>
-                <w:rFonts w:ascii="Arial" w:eastAsia="游ゴシック" w:hAnsi="Arial"/>
-                <w:sz w:val="16"/>
-                <w:szCs w:val="16"/>
-              </w:rPr>
-              <w:t xml:space="preserve">No</w:t>
+                <w:rFonts w:ascii="Arial" w:eastAsia="Yu Gothic" w:hAnsi="Arial"/>
+                <w:sz w:val="16"/>
+                <w:szCs w:val="16"/>
+              </w:rPr>
+              <w:t>No</w:t>
             </w:r>
           </w:p>
         </w:tc>
@@ -1925,11 +1750,11 @@
             </w:pPr>
             <w:r>
               <w:rPr>
-                <w:rFonts w:ascii="Arial" w:eastAsia="游ゴシック" w:hAnsi="Arial"/>
-                <w:sz w:val="16"/>
-                <w:szCs w:val="16"/>
-              </w:rPr>
-              <w:t xml:space="preserve">No (deer)</w:t>
+                <w:rFonts w:ascii="Arial" w:eastAsia="Yu Gothic" w:hAnsi="Arial"/>
+                <w:sz w:val="16"/>
+                <w:szCs w:val="16"/>
+              </w:rPr>
+              <w:t>No (deer)</w:t>
             </w:r>
           </w:p>
         </w:tc>
@@ -1960,7 +1785,7 @@
             </w:pPr>
             <w:r>
               <w:rPr>
-                <w:rFonts w:ascii="Arial" w:eastAsia="游ゴシック" w:hAnsi="Arial"/>
+                <w:rFonts w:ascii="Arial" w:eastAsia="Yu Gothic" w:hAnsi="Arial"/>
                 <w:sz w:val="16"/>
                 <w:szCs w:val="16"/>
               </w:rPr>
@@ -1990,11 +1815,11 @@
             </w:pPr>
             <w:r>
               <w:rPr>
-                <w:rFonts w:ascii="Arial" w:eastAsia="游ゴシック" w:hAnsi="Arial"/>
-                <w:sz w:val="16"/>
-                <w:szCs w:val="16"/>
-              </w:rPr>
-              <w:t xml:space="preserve">Residential</w:t>
+                <w:rFonts w:ascii="Arial" w:eastAsia="Yu Gothic" w:hAnsi="Arial"/>
+                <w:sz w:val="16"/>
+                <w:szCs w:val="16"/>
+              </w:rPr>
+              <w:t>Residential</w:t>
             </w:r>
           </w:p>
         </w:tc>
@@ -2020,7 +1845,7 @@
             </w:pPr>
             <w:r>
               <w:rPr>
-                <w:rFonts w:ascii="Arial" w:eastAsia="游ゴシック" w:hAnsi="Arial"/>
+                <w:rFonts w:ascii="Arial" w:eastAsia="Yu Gothic" w:hAnsi="Arial"/>
                 <w:sz w:val="16"/>
                 <w:szCs w:val="16"/>
               </w:rPr>
@@ -2051,7 +1876,7 @@
             </w:pPr>
             <w:r>
               <w:rPr>
-                <w:rFonts w:ascii="Arial" w:eastAsia="游ゴシック" w:hAnsi="Arial"/>
+                <w:rFonts w:ascii="Arial" w:eastAsia="Yu Gothic" w:hAnsi="Arial"/>
                 <w:sz w:val="16"/>
                 <w:szCs w:val="16"/>
               </w:rPr>
@@ -2082,7 +1907,7 @@
             </w:pPr>
             <w:r>
               <w:rPr>
-                <w:rFonts w:ascii="Arial" w:eastAsia="游ゴシック" w:hAnsi="Arial"/>
+                <w:rFonts w:ascii="Arial" w:eastAsia="Yu Gothic" w:hAnsi="Arial"/>
                 <w:sz w:val="16"/>
                 <w:szCs w:val="16"/>
               </w:rPr>
@@ -2112,11 +1937,11 @@
             </w:pPr>
             <w:r>
               <w:rPr>
-                <w:rFonts w:ascii="Arial" w:eastAsia="游ゴシック" w:hAnsi="Arial"/>
-                <w:sz w:val="16"/>
-                <w:szCs w:val="16"/>
-              </w:rPr>
-              <w:t xml:space="preserve">No</w:t>
+                <w:rFonts w:ascii="Arial" w:eastAsia="Yu Gothic" w:hAnsi="Arial"/>
+                <w:sz w:val="16"/>
+                <w:szCs w:val="16"/>
+              </w:rPr>
+              <w:t>No</w:t>
             </w:r>
           </w:p>
         </w:tc>
@@ -2142,11 +1967,11 @@
             </w:pPr>
             <w:r>
               <w:rPr>
-                <w:rFonts w:ascii="Arial" w:eastAsia="游ゴシック" w:hAnsi="Arial"/>
-                <w:sz w:val="16"/>
-                <w:szCs w:val="16"/>
-              </w:rPr>
-              <w:t xml:space="preserve">No</w:t>
+                <w:rFonts w:ascii="Arial" w:eastAsia="Yu Gothic" w:hAnsi="Arial"/>
+                <w:sz w:val="16"/>
+                <w:szCs w:val="16"/>
+              </w:rPr>
+              <w:t>No</w:t>
             </w:r>
           </w:p>
         </w:tc>
@@ -2158,22 +1983,42 @@
       </w:pPr>
       <w:r>
         <w:rPr>
-          <w:rFonts w:ascii="Arial" w:eastAsia="游ゴシック" w:hAnsi="Arial"/>
+          <w:rFonts w:ascii="Arial" w:eastAsia="Yu Gothic" w:hAnsi="Arial"/>
           <w:b/>
           <w:bCs/>
           <w:sz w:val="16"/>
           <w:szCs w:val="16"/>
         </w:rPr>
-        <w:t xml:space="preserve">Table 2  </w:t>
-      </w:r>
-      <w:r>
-        <w:rPr>
-          <w:rFonts w:ascii="Arial" w:eastAsia="游ゴシック" w:hAnsi="Arial"/>
+        <w:t xml:space="preserve">Table </w:t>
+      </w:r>
+      <w:r>
+        <w:rPr>
+          <w:rFonts w:ascii="Arial" w:eastAsia="Yu Gothic" w:hAnsi="Arial" w:hint="eastAsia"/>
+          <w:b/>
+          <w:bCs/>
+          <w:sz w:val="16"/>
+          <w:szCs w:val="16"/>
+        </w:rPr>
+        <w:t>1</w:t>
+      </w:r>
+      <w:r>
+        <w:rPr>
+          <w:rFonts w:ascii="Arial" w:eastAsia="Yu Gothic" w:hAnsi="Arial"/>
+          <w:b/>
+          <w:bCs/>
+          <w:sz w:val="16"/>
+          <w:szCs w:val="16"/>
+        </w:rPr>
+        <w:t xml:space="preserve">  </w:t>
+      </w:r>
+      <w:r>
+        <w:rPr>
+          <w:rFonts w:ascii="Arial" w:eastAsia="Yu Gothic" w:hAnsi="Arial"/>
           <w:color w:val="5B6570"/>
           <w:sz w:val="16"/>
           <w:szCs w:val="16"/>
         </w:rPr>
-        <w:t xml:space="preserve">TTM forecasts assigned to the 5 sites (7 June 2025, Yamagata Prefecture 10 km grid).</w:t>
+        <w:t>TTM forecasts assigned to the 5 sites (7 June 2025, Yamagata Prefecture 10 km grid).</w:t>
       </w:r>
     </w:p>
     <w:p>
@@ -2199,7 +2044,7 @@
           <w:bCs/>
           <w:color w:val="B3541E"/>
         </w:rPr>
-        <w:t xml:space="preserve">fine-tuned</w:t>
+        <w:t>fine-tuned</w:t>
       </w:r>
       <w:r>
         <w:t xml:space="preserve"> it on Gazebo images. We took 700 images while moving the camera, bears and deer to random positions, and labelled the correct boxes automatically by projecting each bear’s 3D position into the image. Viewpoints where the bear is hidden by trees or buildings were excluded, and 30% of the images contain no bear. Fine-tuning started from the pretrained YOLOv8n (Figure 2, right).</w:t>
@@ -2261,7 +2106,7 @@
       </w:pPr>
       <w:r>
         <w:rPr>
-          <w:rFonts w:ascii="Arial" w:eastAsia="游ゴシック" w:hAnsi="Arial"/>
+          <w:rFonts w:ascii="Arial" w:eastAsia="Yu Gothic" w:hAnsi="Arial"/>
           <w:b/>
           <w:bCs/>
           <w:sz w:val="16"/>
@@ -2271,12 +2116,12 @@
       </w:r>
       <w:r>
         <w:rPr>
-          <w:rFonts w:ascii="Arial" w:eastAsia="游ゴシック" w:hAnsi="Arial"/>
+          <w:rFonts w:ascii="Arial" w:eastAsia="Yu Gothic" w:hAnsi="Arial"/>
           <w:color w:val="5B6570"/>
           <w:sz w:val="16"/>
           <w:szCs w:val="16"/>
         </w:rPr>
-        <w:t xml:space="preserve">Left: COCO-pretrained YOLOv8s mistakes the Gazebo bear for a “traffic light”. Right: the fine-tuned YOLOv8n labels it “bear” (confidence 0.97).</w:t>
+        <w:t>Left: COCO-pretrained YOLOv8s mistakes the Gazebo bear for a “traffic light”. Right: the fine-tuned YOLOv8n labels it “bear” (confidence 0.97).</w:t>
       </w:r>
     </w:p>
     <w:p>
@@ -2286,15 +2131,21 @@
       </w:pPr>
       <w:r>
         <w:rPr>
-          <w:rFonts w:ascii="Consolas" w:eastAsia="游ゴシック" w:hAnsi="Consolas"/>
+          <w:rFonts w:ascii="Consolas" w:eastAsia="Yu Gothic" w:hAnsi="Consolas"/>
           <w:sz w:val="17"/>
           <w:szCs w:val="17"/>
         </w:rPr>
-        <w:t xml:space="preserve">bear_detector</w:t>
+        <w:t>bear_detector</w:t>
       </w:r>
       <w:r>
         <w:t xml:space="preserve"> computes the bear’s bearing relative to the camera from the horizontal position of the box, and its distance from the LiDAR reading in that direction; combined with the robot’s own pose, this gives the bear’s position on the map. If the LiDAR hits a tree in front, it switches to an estimate from the box height. To avoid stopping on false detections, it asks the robot to stop only after 3 consecutive detections within 4 m.</w:t>
       </w:r>
+    </w:p>
+    <w:p>
+      <w:pPr>
+        <w:spacing w:after="100"/>
+        <w:jc w:val="both"/>
+      </w:pPr>
     </w:p>
     <w:tbl>
       <w:tblPr>
@@ -2346,13 +2197,14 @@
             </w:pPr>
             <w:r>
               <w:rPr>
-                <w:rFonts w:ascii="Arial" w:eastAsia="游ゴシック" w:hAnsi="Arial"/>
+                <w:rFonts w:ascii="Arial" w:eastAsia="Yu Gothic" w:hAnsi="Arial"/>
                 <w:b/>
                 <w:bCs/>
                 <w:sz w:val="16"/>
                 <w:szCs w:val="16"/>
               </w:rPr>
-              <w:t xml:space="preserve">Precision (105 validation images)</w:t>
+              <w:lastRenderedPageBreak/>
+              <w:t>Precision (105 validation images)</w:t>
             </w:r>
           </w:p>
         </w:tc>
@@ -2378,13 +2230,13 @@
             </w:pPr>
             <w:r>
               <w:rPr>
-                <w:rFonts w:ascii="Arial" w:eastAsia="游ゴシック" w:hAnsi="Arial"/>
+                <w:rFonts w:ascii="Arial" w:eastAsia="Yu Gothic" w:hAnsi="Arial"/>
                 <w:b/>
                 <w:bCs/>
                 <w:sz w:val="16"/>
                 <w:szCs w:val="16"/>
               </w:rPr>
-              <w:t xml:space="preserve">Recall (105 validation images)</w:t>
+              <w:t>Recall (105 validation images)</w:t>
             </w:r>
           </w:p>
         </w:tc>
@@ -2410,7 +2262,7 @@
             </w:pPr>
             <w:r>
               <w:rPr>
-                <w:rFonts w:ascii="Arial" w:eastAsia="游ゴシック" w:hAnsi="Arial"/>
+                <w:rFonts w:ascii="Arial" w:eastAsia="Yu Gothic" w:hAnsi="Arial"/>
                 <w:b/>
                 <w:bCs/>
                 <w:sz w:val="16"/>
@@ -2442,13 +2294,13 @@
             </w:pPr>
             <w:r>
               <w:rPr>
-                <w:rFonts w:ascii="Arial" w:eastAsia="游ゴシック" w:hAnsi="Arial"/>
+                <w:rFonts w:ascii="Arial" w:eastAsia="Yu Gothic" w:hAnsi="Arial"/>
                 <w:b/>
                 <w:bCs/>
                 <w:sz w:val="16"/>
                 <w:szCs w:val="16"/>
               </w:rPr>
-              <w:t xml:space="preserve">Patrol viewpoints</w:t>
+              <w:t>Patrol viewpoints</w:t>
             </w:r>
           </w:p>
         </w:tc>
@@ -2479,7 +2331,7 @@
             </w:pPr>
             <w:r>
               <w:rPr>
-                <w:rFonts w:ascii="Arial" w:eastAsia="游ゴシック" w:hAnsi="Arial"/>
+                <w:rFonts w:ascii="Arial" w:eastAsia="Yu Gothic" w:hAnsi="Arial"/>
                 <w:sz w:val="16"/>
                 <w:szCs w:val="16"/>
               </w:rPr>
@@ -2509,7 +2361,7 @@
             </w:pPr>
             <w:r>
               <w:rPr>
-                <w:rFonts w:ascii="Arial" w:eastAsia="游ゴシック" w:hAnsi="Arial"/>
+                <w:rFonts w:ascii="Arial" w:eastAsia="Yu Gothic" w:hAnsi="Arial"/>
                 <w:sz w:val="16"/>
                 <w:szCs w:val="16"/>
               </w:rPr>
@@ -2539,7 +2391,7 @@
             </w:pPr>
             <w:r>
               <w:rPr>
-                <w:rFonts w:ascii="Arial" w:eastAsia="游ゴシック" w:hAnsi="Arial"/>
+                <w:rFonts w:ascii="Arial" w:eastAsia="Yu Gothic" w:hAnsi="Arial"/>
                 <w:sz w:val="16"/>
                 <w:szCs w:val="16"/>
               </w:rPr>
@@ -2569,7 +2421,7 @@
             </w:pPr>
             <w:r>
               <w:rPr>
-                <w:rFonts w:ascii="Arial" w:eastAsia="游ゴシック" w:hAnsi="Arial"/>
+                <w:rFonts w:ascii="Arial" w:eastAsia="Yu Gothic" w:hAnsi="Arial"/>
                 <w:sz w:val="16"/>
                 <w:szCs w:val="16"/>
               </w:rPr>
@@ -2585,17 +2437,37 @@
       </w:pPr>
       <w:r>
         <w:rPr>
-          <w:rFonts w:ascii="Arial" w:eastAsia="游ゴシック" w:hAnsi="Arial"/>
+          <w:rFonts w:ascii="Arial" w:eastAsia="Yu Gothic" w:hAnsi="Arial"/>
           <w:b/>
           <w:bCs/>
           <w:sz w:val="16"/>
           <w:szCs w:val="16"/>
         </w:rPr>
-        <w:t xml:space="preserve">Table 3  </w:t>
-      </w:r>
-      <w:r>
-        <w:rPr>
-          <w:rFonts w:ascii="Arial" w:eastAsia="游ゴシック" w:hAnsi="Arial"/>
+        <w:t xml:space="preserve">Table </w:t>
+      </w:r>
+      <w:r>
+        <w:rPr>
+          <w:rFonts w:ascii="Arial" w:eastAsia="Yu Gothic" w:hAnsi="Arial" w:hint="eastAsia"/>
+          <w:b/>
+          <w:bCs/>
+          <w:sz w:val="16"/>
+          <w:szCs w:val="16"/>
+        </w:rPr>
+        <w:t>2</w:t>
+      </w:r>
+      <w:r>
+        <w:rPr>
+          <w:rFonts w:ascii="Arial" w:eastAsia="Yu Gothic" w:hAnsi="Arial"/>
+          <w:b/>
+          <w:bCs/>
+          <w:sz w:val="16"/>
+          <w:szCs w:val="16"/>
+        </w:rPr>
+        <w:t xml:space="preserve">  </w:t>
+      </w:r>
+      <w:r>
+        <w:rPr>
+          <w:rFonts w:ascii="Arial" w:eastAsia="Yu Gothic" w:hAnsi="Arial"/>
           <w:color w:val="5B6570"/>
           <w:sz w:val="16"/>
           <w:szCs w:val="16"/>
@@ -2609,7 +2481,7 @@
         <w:jc w:val="both"/>
       </w:pPr>
       <w:r>
-        <w:t xml:space="preserve">On 11 patrol viewpoints (approaching and arriving at P2 and P4; bear-free P1, P3 and P5; the deer; the forest edge, etc.), every viewpoint showing a bear was detected (confidence 0.88–0.98), and deer, trees and buildings were never mistaken for bears. As a ROS 2 node, we also confirmed that it detects bears in the Gazebo camera stream and publishes the stop message.</w:t>
+        <w:t>On 11 patrol viewpoints (approaching and arriving at P2 and P4; bear-free P1, P3 and P5; the deer; the forest edge, etc.), every viewpoint showing a bear was detected (confidence 0.88–0.98), and deer, trees and buildings were never mistaken for bears. As a ROS 2 node, we also confirmed that it detects bears in the Gazebo camera stream and publishes the stop message.</w:t>
       </w:r>
     </w:p>
     <w:p>
@@ -2633,18 +2505,27 @@
         <w:jc w:val="both"/>
       </w:pPr>
       <w:r>
-        <w:t xml:space="preserve">The software consists of five ROS 2 packages (Table 1). The world and the Nav2 map are both generated automatically from the same definition file (</w:t>
-      </w:r>
-      <w:r>
-        <w:rPr>
-          <w:rFonts w:ascii="Consolas" w:eastAsia="游ゴシック" w:hAnsi="Consolas"/>
+        <w:t xml:space="preserve">The software consists of five ROS 2 packages (Table </w:t>
+      </w:r>
+      <w:r>
+        <w:rPr>
+          <w:rFonts w:hint="eastAsia"/>
+        </w:rPr>
+        <w:t>3</w:t>
+      </w:r>
+      <w:r>
+        <w:t>). The world and the Nav2 map are both generated automatically from the same definition file (</w:t>
+      </w:r>
+      <w:r>
+        <w:rPr>
+          <w:rFonts w:ascii="Consolas" w:eastAsia="Yu Gothic" w:hAnsi="Consolas"/>
           <w:sz w:val="17"/>
           <w:szCs w:val="17"/>
         </w:rPr>
-        <w:t xml:space="preserve">world_layout.yaml</w:t>
-      </w:r>
-      <w:r>
-        <w:t xml:space="preserve">), so their coordinates match without building a map by SLAM. Bears and deer are not on the map; the robot finds them with the LiDAR and camera as unknown obstacles.</w:t>
+        <w:t>world_layout.yaml</w:t>
+      </w:r>
+      <w:r>
+        <w:t>), so their coordinates match without building a map by SLAM. Bears and deer are not on the map; the robot finds them with the LiDAR and camera as unknown obstacles.</w:t>
       </w:r>
     </w:p>
     <w:tbl>
@@ -2695,14 +2576,13 @@
             </w:pPr>
             <w:r>
               <w:rPr>
-                <w:rFonts w:ascii="Arial" w:eastAsia="游ゴシック" w:hAnsi="Arial"/>
+                <w:rFonts w:ascii="Arial" w:eastAsia="Yu Gothic" w:hAnsi="Arial"/>
                 <w:b/>
                 <w:bCs/>
                 <w:sz w:val="16"/>
                 <w:szCs w:val="16"/>
               </w:rPr>
-              <w:lastRenderedPageBreak/>
-              <w:t xml:space="preserve">Node</w:t>
+              <w:t>Node</w:t>
             </w:r>
           </w:p>
         </w:tc>
@@ -2728,13 +2608,13 @@
             </w:pPr>
             <w:r>
               <w:rPr>
-                <w:rFonts w:ascii="Arial" w:eastAsia="游ゴシック" w:hAnsi="Arial"/>
+                <w:rFonts w:ascii="Arial" w:eastAsia="Yu Gothic" w:hAnsi="Arial"/>
                 <w:b/>
                 <w:bCs/>
                 <w:sz w:val="16"/>
                 <w:szCs w:val="16"/>
               </w:rPr>
-              <w:t xml:space="preserve">Role</w:t>
+              <w:t>Role</w:t>
             </w:r>
           </w:p>
         </w:tc>
@@ -2765,7 +2645,7 @@
             </w:pPr>
             <w:r>
               <w:rPr>
-                <w:rFonts w:ascii="Arial" w:eastAsia="游ゴシック" w:hAnsi="Arial"/>
+                <w:rFonts w:ascii="Arial" w:eastAsia="Yu Gothic" w:hAnsi="Arial"/>
                 <w:sz w:val="16"/>
                 <w:szCs w:val="16"/>
               </w:rPr>
@@ -2795,11 +2675,11 @@
             </w:pPr>
             <w:r>
               <w:rPr>
-                <w:rFonts w:ascii="Arial" w:eastAsia="游ゴシック" w:hAnsi="Arial"/>
-                <w:sz w:val="16"/>
-                <w:szCs w:val="16"/>
-              </w:rPr>
-              <w:t xml:space="preserve">Publishes the TTM forecasts as the risk of the 5 sites and shows them as bars in RViz</w:t>
+                <w:rFonts w:ascii="Arial" w:eastAsia="Yu Gothic" w:hAnsi="Arial"/>
+                <w:sz w:val="16"/>
+                <w:szCs w:val="16"/>
+              </w:rPr>
+              <w:t>Publishes the TTM forecasts as the risk of the 5 sites and shows them as bars in RViz</w:t>
             </w:r>
           </w:p>
         </w:tc>
@@ -2830,7 +2710,7 @@
             </w:pPr>
             <w:r>
               <w:rPr>
-                <w:rFonts w:ascii="Arial" w:eastAsia="游ゴシック" w:hAnsi="Arial"/>
+                <w:rFonts w:ascii="Arial" w:eastAsia="Yu Gothic" w:hAnsi="Arial"/>
                 <w:sz w:val="16"/>
                 <w:szCs w:val="16"/>
               </w:rPr>
@@ -2860,7 +2740,7 @@
             </w:pPr>
             <w:r>
               <w:rPr>
-                <w:rFonts w:ascii="Arial" w:eastAsia="游ゴシック" w:hAnsi="Arial"/>
+                <w:rFonts w:ascii="Arial" w:eastAsia="Yu Gothic" w:hAnsi="Arial"/>
                 <w:sz w:val="16"/>
                 <w:szCs w:val="16"/>
               </w:rPr>
@@ -2895,7 +2775,7 @@
             </w:pPr>
             <w:r>
               <w:rPr>
-                <w:rFonts w:ascii="Arial" w:eastAsia="游ゴシック" w:hAnsi="Arial"/>
+                <w:rFonts w:ascii="Arial" w:eastAsia="Yu Gothic" w:hAnsi="Arial"/>
                 <w:sz w:val="16"/>
                 <w:szCs w:val="16"/>
               </w:rPr>
@@ -2925,11 +2805,11 @@
             </w:pPr>
             <w:r>
               <w:rPr>
-                <w:rFonts w:ascii="Arial" w:eastAsia="游ゴシック" w:hAnsi="Arial"/>
-                <w:sz w:val="16"/>
-                <w:szCs w:val="16"/>
-              </w:rPr>
-              <w:t xml:space="preserve">Checks camera images with YOLOv8 and estimates the bear’s map position from the LiDAR range</w:t>
+                <w:rFonts w:ascii="Arial" w:eastAsia="Yu Gothic" w:hAnsi="Arial"/>
+                <w:sz w:val="16"/>
+                <w:szCs w:val="16"/>
+              </w:rPr>
+              <w:t>Checks camera images with YOLOv8 and estimates the bear’s map position from the LiDAR range</w:t>
             </w:r>
           </w:p>
         </w:tc>
@@ -2960,7 +2840,7 @@
             </w:pPr>
             <w:r>
               <w:rPr>
-                <w:rFonts w:ascii="Arial" w:eastAsia="游ゴシック" w:hAnsi="Arial"/>
+                <w:rFonts w:ascii="Arial" w:eastAsia="Yu Gothic" w:hAnsi="Arial"/>
                 <w:sz w:val="16"/>
                 <w:szCs w:val="16"/>
               </w:rPr>
@@ -2990,11 +2870,11 @@
             </w:pPr>
             <w:r>
               <w:rPr>
-                <w:rFonts w:ascii="Arial" w:eastAsia="游ゴシック" w:hAnsi="Arial"/>
-                <w:sz w:val="16"/>
-                <w:szCs w:val="16"/>
-              </w:rPr>
-              <w:t xml:space="preserve">Records the camera and the detection-box video with a status overlay; saves a still when a bear is detected</w:t>
+                <w:rFonts w:ascii="Arial" w:eastAsia="Yu Gothic" w:hAnsi="Arial"/>
+                <w:sz w:val="16"/>
+                <w:szCs w:val="16"/>
+              </w:rPr>
+              <w:t>Records the camera and the detection-box video with a status overlay; saves a still when a bear is detected</w:t>
             </w:r>
           </w:p>
         </w:tc>
@@ -3025,7 +2905,7 @@
             </w:pPr>
             <w:r>
               <w:rPr>
-                <w:rFonts w:ascii="Arial" w:eastAsia="游ゴシック" w:hAnsi="Arial"/>
+                <w:rFonts w:ascii="Arial" w:eastAsia="Yu Gothic" w:hAnsi="Arial"/>
                 <w:sz w:val="16"/>
                 <w:szCs w:val="16"/>
               </w:rPr>
@@ -3055,11 +2935,11 @@
             </w:pPr>
             <w:r>
               <w:rPr>
-                <w:rFonts w:ascii="Arial" w:eastAsia="游ゴシック" w:hAnsi="Arial"/>
-                <w:sz w:val="16"/>
-                <w:szCs w:val="16"/>
-              </w:rPr>
-              <w:t xml:space="preserve">Simple detector using the distance to known bear coordinates (for comparison and testing)</w:t>
+                <w:rFonts w:ascii="Arial" w:eastAsia="Yu Gothic" w:hAnsi="Arial"/>
+                <w:sz w:val="16"/>
+                <w:szCs w:val="16"/>
+              </w:rPr>
+              <w:t>Simple detector using the distance to known bear coordinates (for comparison and testing)</w:t>
             </w:r>
           </w:p>
         </w:tc>
@@ -3071,22 +2951,42 @@
       </w:pPr>
       <w:r>
         <w:rPr>
-          <w:rFonts w:ascii="Arial" w:eastAsia="游ゴシック" w:hAnsi="Arial"/>
+          <w:rFonts w:ascii="Arial" w:eastAsia="Yu Gothic" w:hAnsi="Arial"/>
           <w:b/>
           <w:bCs/>
           <w:sz w:val="16"/>
           <w:szCs w:val="16"/>
         </w:rPr>
-        <w:t xml:space="preserve">Table 1  Main nodes.  </w:t>
-      </w:r>
-      <w:r>
-        <w:rPr>
-          <w:rFonts w:ascii="Arial" w:eastAsia="游ゴシック" w:hAnsi="Arial"/>
+        <w:t xml:space="preserve">Table </w:t>
+      </w:r>
+      <w:r>
+        <w:rPr>
+          <w:rFonts w:ascii="Arial" w:eastAsia="Yu Gothic" w:hAnsi="Arial" w:hint="eastAsia"/>
+          <w:b/>
+          <w:bCs/>
+          <w:sz w:val="16"/>
+          <w:szCs w:val="16"/>
+        </w:rPr>
+        <w:t>3</w:t>
+      </w:r>
+      <w:r>
+        <w:rPr>
+          <w:rFonts w:ascii="Arial" w:eastAsia="Yu Gothic" w:hAnsi="Arial"/>
+          <w:b/>
+          <w:bCs/>
+          <w:sz w:val="16"/>
+          <w:szCs w:val="16"/>
+        </w:rPr>
+        <w:t xml:space="preserve">  Main nodes.  </w:t>
+      </w:r>
+      <w:r>
+        <w:rPr>
+          <w:rFonts w:ascii="Arial" w:eastAsia="Yu Gothic" w:hAnsi="Arial"/>
           <w:color w:val="5B6570"/>
           <w:sz w:val="16"/>
           <w:szCs w:val="16"/>
         </w:rPr>
-        <w:t xml:space="preserve">The state machine moves through RISK_ASSESSMENT → ROUTE_PLANNING → PATROL ⇄ OBSERVE → (EMERGENCY_STOP) → RETURN_TO_BASE → FINISHED.</w:t>
+        <w:t>The state machine moves through RISK_ASSESSMENT → ROUTE_PLANNING → PATROL ⇄ OBSERVE → (EMERGENCY_STOP) → RETURN_TO_BASE → FINISHED.</w:t>
       </w:r>
     </w:p>
     <w:p>
@@ -3123,12 +3023,116 @@
         <w:rPr>
           <w:noProof/>
         </w:rPr>
-        <w:lastRenderedPageBreak/>
         <w:drawing>
           <wp:inline distT="0" distB="0" distL="0" distR="0" wp14:anchorId="0B3A02AE" wp14:editId="4B858CD3">
             <wp:extent cx="3425190" cy="1926669"/>
             <wp:effectExtent l="0" t="0" r="0" b="0"/>
             <wp:docPr id="4" name="図 4"/>
+            <wp:cNvGraphicFramePr>
+              <a:graphicFrameLocks xmlns:a="http://schemas.openxmlformats.org/drawingml/2006/main" noChangeAspect="1"/>
+            </wp:cNvGraphicFramePr>
+            <a:graphic xmlns:a="http://schemas.openxmlformats.org/drawingml/2006/main">
+              <a:graphicData uri="http://schemas.openxmlformats.org/drawingml/2006/picture">
+                <pic:pic xmlns:pic="http://schemas.openxmlformats.org/drawingml/2006/picture">
+                  <pic:nvPicPr>
+                    <pic:cNvPr id="0" name=""/>
+                    <pic:cNvPicPr>
+                      <a:picLocks noChangeAspect="1" noChangeArrowheads="1"/>
+                    </pic:cNvPicPr>
+                  </pic:nvPicPr>
+                  <pic:blipFill>
+                    <a:blip r:embed="rId9"/>
+                    <a:srcRect/>
+                    <a:stretch>
+                      <a:fillRect/>
+                    </a:stretch>
+                  </pic:blipFill>
+                  <pic:spPr bwMode="auto">
+                    <a:xfrm>
+                      <a:off x="0" y="0"/>
+                      <a:ext cx="3425190" cy="1926669"/>
+                    </a:xfrm>
+                    <a:prstGeom prst="rect">
+                      <a:avLst/>
+                    </a:prstGeom>
+                  </pic:spPr>
+                </pic:pic>
+              </a:graphicData>
+            </a:graphic>
+          </wp:inline>
+        </w:drawing>
+      </w:r>
+    </w:p>
+    <w:p>
+      <w:pPr>
+        <w:spacing w:before="40" w:after="160" w:line="280" w:lineRule="auto"/>
+      </w:pPr>
+      <w:r>
+        <w:rPr>
+          <w:rFonts w:ascii="Arial" w:eastAsia="Yu Gothic" w:hAnsi="Arial"/>
+          <w:b/>
+          <w:bCs/>
+          <w:sz w:val="16"/>
+          <w:szCs w:val="16"/>
+        </w:rPr>
+        <w:t xml:space="preserve">Figure 3  The run in Gazebo (from the submission video).  </w:t>
+      </w:r>
+      <w:r>
+        <w:rPr>
+          <w:rFonts w:ascii="Arial" w:eastAsia="Yu Gothic" w:hAnsi="Arial"/>
+          <w:color w:val="5B6570"/>
+          <w:sz w:val="16"/>
+          <w:szCs w:val="16"/>
+        </w:rPr>
+        <w:t>Left: the robot’s camera image with the YOLOv8 box (the bear at P2, confidence 0.87 at 5.0 m, before the 4 m stopping distance); right: a map drawn from the logged robot pose. The top bar shows the patrol state (Mission 1/3, AI risk).</w:t>
+      </w:r>
+    </w:p>
+    <w:p>
+      <w:pPr>
+        <w:spacing w:after="100"/>
+        <w:jc w:val="both"/>
+      </w:pPr>
+      <w:r>
+        <w:rPr>
+          <w:b/>
+        </w:rPr>
+        <w:t xml:space="preserve">At P2, path planning to the safe spot failed because of the obstacle layout. </w:t>
+      </w:r>
+      <w:r>
+        <w:t>The retreat target (−2.7, −2.2) was next to a building, and Nav2 could not make a path. This prototype then switched to continuing the patrol, but in real operation a safe stop, a search for an alternative retreat spot, and a notification to the operator must take priority. This is a safety-control issue to be fixed.</w:t>
+      </w:r>
+    </w:p>
+    <w:p>
+      <w:pPr>
+        <w:pStyle w:val="1"/>
+        <w:keepNext/>
+        <w:pBdr>
+          <w:bottom w:val="single" w:sz="6" w:space="2" w:color="CFD6DD"/>
+        </w:pBdr>
+      </w:pPr>
+      <w:r>
+        <w:rPr>
+          <w:color w:val="1F5F8B"/>
+        </w:rPr>
+        <w:lastRenderedPageBreak/>
+        <w:t>6  Comparison with a Fixed Route</w:t>
+      </w:r>
+    </w:p>
+    <w:p>
+      <w:pPr>
+        <w:keepNext/>
+        <w:spacing w:before="80" w:after="20" w:line="240" w:lineRule="auto"/>
+        <w:jc w:val="center"/>
+      </w:pPr>
+      <w:r>
+        <w:rPr>
+          <w:noProof/>
+        </w:rPr>
+        <w:drawing>
+          <wp:inline distT="0" distB="0" distL="0" distR="0" wp14:anchorId="4AA5D54E" wp14:editId="56F4DFC9">
+            <wp:extent cx="3467100" cy="1952986"/>
+            <wp:effectExtent l="0" t="0" r="0" b="0"/>
+            <wp:docPr id="3" name="図 3"/>
             <wp:cNvGraphicFramePr>
               <a:graphicFrameLocks xmlns:a="http://schemas.openxmlformats.org/drawingml/2006/main" noChangeAspect="1"/>
             </wp:cNvGraphicFramePr>
@@ -3151,110 +3155,6 @@
                   <pic:spPr bwMode="auto">
                     <a:xfrm>
                       <a:off x="0" y="0"/>
-                      <a:ext cx="3425190" cy="1926669"/>
-                    </a:xfrm>
-                    <a:prstGeom prst="rect">
-                      <a:avLst/>
-                    </a:prstGeom>
-                  </pic:spPr>
-                </pic:pic>
-              </a:graphicData>
-            </a:graphic>
-          </wp:inline>
-        </w:drawing>
-      </w:r>
-    </w:p>
-    <w:p>
-      <w:pPr>
-        <w:spacing w:before="40" w:after="160" w:line="280" w:lineRule="auto"/>
-      </w:pPr>
-      <w:r>
-        <w:rPr>
-          <w:rFonts w:ascii="Arial" w:eastAsia="游ゴシック" w:hAnsi="Arial"/>
-          <w:b/>
-          <w:bCs/>
-          <w:sz w:val="16"/>
-          <w:szCs w:val="16"/>
-        </w:rPr>
-        <w:t xml:space="preserve">Figure 3  The run in Gazebo (from the submission video).  </w:t>
-      </w:r>
-      <w:r>
-        <w:rPr>
-          <w:rFonts w:ascii="Arial" w:eastAsia="游ゴシック" w:hAnsi="Arial"/>
-          <w:color w:val="5B6570"/>
-          <w:sz w:val="16"/>
-          <w:szCs w:val="16"/>
-        </w:rPr>
-        <w:t>Left: the robot’s camera image with the YOLOv8 box (the bear at P2, confidence 0.87 at 5.0 m, before the 4 m stopping distance); right: a map drawn from the logged robot pose. The top bar shows the patrol state (Mission 1/3, AI risk).</w:t>
-      </w:r>
-    </w:p>
-    <w:p>
-      <w:pPr>
-        <w:spacing w:after="100"/>
-        <w:jc w:val="both"/>
-      </w:pPr>
-      <w:r>
-        <w:rPr>
-          <w:b/>
-        </w:rPr>
-        <w:t xml:space="preserve">At P2, path planning to the safe spot failed because of the obstacle layout. </w:t>
-      </w:r>
-      <w:r>
-        <w:t>The retreat target (−2.7, −2.2) was next to a building, and Nav2 could not make a path. This prototype then switched to continuing the patrol, but in real operation a safe stop, a search for an alternative retreat spot, and a notification to the operator must take priority. This is a safety-control issue to be fixed.</w:t>
-      </w:r>
-    </w:p>
-    <w:p>
-      <w:pPr>
-        <w:pStyle w:val="1"/>
-        <w:keepNext/>
-        <w:pBdr>
-          <w:bottom w:val="single" w:sz="6" w:space="2" w:color="CFD6DD"/>
-        </w:pBdr>
-      </w:pPr>
-      <w:r>
-        <w:rPr>
-          <w:color w:val="1F5F8B"/>
-        </w:rPr>
-        <w:t>6  Comparison with a Fixed Route</w:t>
-      </w:r>
-    </w:p>
-    <w:p>
-      <w:pPr>
-        <w:keepNext/>
-        <w:spacing w:before="80" w:after="20" w:line="240" w:lineRule="auto"/>
-        <w:jc w:val="center"/>
-      </w:pPr>
-      <w:r>
-        <w:rPr>
-          <w:noProof/>
-        </w:rPr>
-        <w:drawing>
-          <wp:inline distT="0" distB="0" distL="0" distR="0" wp14:anchorId="4AA5D54E" wp14:editId="56F4DFC9">
-            <wp:extent cx="3467100" cy="1952986"/>
-            <wp:effectExtent l="0" t="0" r="0" b="0"/>
-            <wp:docPr id="3" name="図 3"/>
-            <wp:cNvGraphicFramePr>
-              <a:graphicFrameLocks xmlns:a="http://schemas.openxmlformats.org/drawingml/2006/main" noChangeAspect="1"/>
-            </wp:cNvGraphicFramePr>
-            <a:graphic xmlns:a="http://schemas.openxmlformats.org/drawingml/2006/main">
-              <a:graphicData uri="http://schemas.openxmlformats.org/drawingml/2006/picture">
-                <pic:pic xmlns:pic="http://schemas.openxmlformats.org/drawingml/2006/picture">
-                  <pic:nvPicPr>
-                    <pic:cNvPr id="0" name=""/>
-                    <pic:cNvPicPr>
-                      <a:picLocks noChangeAspect="1" noChangeArrowheads="1"/>
-                    </pic:cNvPicPr>
-                  </pic:nvPicPr>
-                  <pic:blipFill>
-                    <a:blip r:embed="rId9"/>
-                    <a:srcRect/>
-                    <a:stretch>
-                      <a:fillRect/>
-                    </a:stretch>
-                  </pic:blipFill>
-                  <pic:spPr bwMode="auto">
-                    <a:xfrm>
-                      <a:off x="0" y="0"/>
                       <a:ext cx="3467100" cy="1952986"/>
                     </a:xfrm>
                     <a:prstGeom prst="rect">
@@ -3274,7 +3174,7 @@
       </w:pPr>
       <w:r>
         <w:rPr>
-          <w:rFonts w:ascii="Arial" w:eastAsia="游ゴシック" w:hAnsi="Arial"/>
+          <w:rFonts w:ascii="Arial" w:eastAsia="Yu Gothic" w:hAnsi="Arial"/>
           <w:b/>
           <w:bCs/>
           <w:sz w:val="16"/>
@@ -3284,7 +3184,7 @@
       </w:r>
       <w:r>
         <w:rPr>
-          <w:rFonts w:ascii="Arial" w:eastAsia="游ゴシック" w:hAnsi="Arial"/>
+          <w:rFonts w:ascii="Arial" w:eastAsia="Yu Gothic" w:hAnsi="Arial"/>
           <w:color w:val="5B6570"/>
           <w:sz w:val="16"/>
           <w:szCs w:val="16"/>
@@ -3341,7 +3241,7 @@
             </w:pPr>
             <w:r>
               <w:rPr>
-                <w:rFonts w:ascii="Arial" w:eastAsia="游ゴシック" w:hAnsi="Arial"/>
+                <w:rFonts w:ascii="Arial" w:eastAsia="Yu Gothic" w:hAnsi="Arial"/>
                 <w:b/>
                 <w:bCs/>
                 <w:sz w:val="16"/>
@@ -3374,7 +3274,7 @@
             </w:pPr>
             <w:r>
               <w:rPr>
-                <w:rFonts w:ascii="Arial" w:eastAsia="游ゴシック" w:hAnsi="Arial"/>
+                <w:rFonts w:ascii="Arial" w:eastAsia="Yu Gothic" w:hAnsi="Arial"/>
                 <w:b/>
                 <w:bCs/>
                 <w:sz w:val="16"/>
@@ -3407,7 +3307,7 @@
             </w:pPr>
             <w:r>
               <w:rPr>
-                <w:rFonts w:ascii="Arial" w:eastAsia="游ゴシック" w:hAnsi="Arial"/>
+                <w:rFonts w:ascii="Arial" w:eastAsia="Yu Gothic" w:hAnsi="Arial"/>
                 <w:b/>
                 <w:bCs/>
                 <w:sz w:val="16"/>
@@ -3431,21 +3331,21 @@
               <w:bottom w:val="single" w:sz="4" w:space="0" w:color="CFD6DD"/>
               <w:right w:val="none" w:sz="0" w:space="0" w:color="FFFFFF"/>
             </w:tcBorders>
-            <w:tcMar>
-              <w:top w:w="50" w:type="dxa"/>
-              <w:left w:w="90" w:type="dxa"/>
-              <w:bottom w:w="50" w:type="dxa"/>
-              <w:right w:w="90" w:type="dxa"/>
-            </w:tcMar>
             <w:shd w:val="clear" w:color="auto" w:fill="FBEEE6"/>
-          </w:tcPr>
-          <w:p>
-            <w:pPr>
-              <w:spacing w:line="260" w:lineRule="auto"/>
-            </w:pPr>
-            <w:r>
-              <w:rPr>
-                <w:rFonts w:ascii="Arial" w:eastAsia="游ゴシック" w:hAnsi="Arial"/>
+            <w:tcMar>
+              <w:top w:w="50" w:type="dxa"/>
+              <w:left w:w="90" w:type="dxa"/>
+              <w:bottom w:w="50" w:type="dxa"/>
+              <w:right w:w="90" w:type="dxa"/>
+            </w:tcMar>
+          </w:tcPr>
+          <w:p>
+            <w:pPr>
+              <w:spacing w:line="260" w:lineRule="auto"/>
+            </w:pPr>
+            <w:r>
+              <w:rPr>
+                <w:rFonts w:ascii="Arial" w:eastAsia="Yu Gothic" w:hAnsi="Arial"/>
                 <w:sz w:val="16"/>
                 <w:szCs w:val="16"/>
               </w:rPr>
@@ -3462,13 +3362,13 @@
               <w:bottom w:val="single" w:sz="4" w:space="0" w:color="CFD6DD"/>
               <w:right w:val="none" w:sz="0" w:space="0" w:color="FFFFFF"/>
             </w:tcBorders>
-            <w:tcMar>
-              <w:top w:w="50" w:type="dxa"/>
-              <w:left w:w="90" w:type="dxa"/>
-              <w:bottom w:w="50" w:type="dxa"/>
-              <w:right w:w="90" w:type="dxa"/>
-            </w:tcMar>
             <w:shd w:val="clear" w:color="auto" w:fill="FBEEE6"/>
+            <w:tcMar>
+              <w:top w:w="50" w:type="dxa"/>
+              <w:left w:w="90" w:type="dxa"/>
+              <w:bottom w:w="50" w:type="dxa"/>
+              <w:right w:w="90" w:type="dxa"/>
+            </w:tcMar>
           </w:tcPr>
           <w:p>
             <w:pPr>
@@ -3477,7 +3377,7 @@
             </w:pPr>
             <w:r>
               <w:rPr>
-                <w:rFonts w:ascii="Arial" w:eastAsia="游ゴシック" w:hAnsi="Arial"/>
+                <w:rFonts w:ascii="Arial" w:eastAsia="Yu Gothic" w:hAnsi="Arial"/>
                 <w:sz w:val="16"/>
                 <w:szCs w:val="16"/>
               </w:rPr>
@@ -3494,13 +3394,13 @@
               <w:bottom w:val="single" w:sz="4" w:space="0" w:color="CFD6DD"/>
               <w:right w:val="none" w:sz="0" w:space="0" w:color="FFFFFF"/>
             </w:tcBorders>
-            <w:tcMar>
-              <w:top w:w="50" w:type="dxa"/>
-              <w:left w:w="90" w:type="dxa"/>
-              <w:bottom w:w="50" w:type="dxa"/>
-              <w:right w:w="90" w:type="dxa"/>
-            </w:tcMar>
             <w:shd w:val="clear" w:color="auto" w:fill="FBEEE6"/>
+            <w:tcMar>
+              <w:top w:w="50" w:type="dxa"/>
+              <w:left w:w="90" w:type="dxa"/>
+              <w:bottom w:w="50" w:type="dxa"/>
+              <w:right w:w="90" w:type="dxa"/>
+            </w:tcMar>
           </w:tcPr>
           <w:p>
             <w:pPr>
@@ -3509,7 +3409,7 @@
             </w:pPr>
             <w:r>
               <w:rPr>
-                <w:rFonts w:ascii="Arial" w:eastAsia="游ゴシック" w:hAnsi="Arial"/>
+                <w:rFonts w:ascii="Arial" w:eastAsia="Yu Gothic" w:hAnsi="Arial"/>
                 <w:sz w:val="16"/>
                 <w:szCs w:val="16"/>
               </w:rPr>
@@ -3544,7 +3444,7 @@
             </w:pPr>
             <w:r>
               <w:rPr>
-                <w:rFonts w:ascii="Arial" w:eastAsia="游ゴシック" w:hAnsi="Arial"/>
+                <w:rFonts w:ascii="Arial" w:eastAsia="Yu Gothic" w:hAnsi="Arial"/>
                 <w:sz w:val="16"/>
                 <w:szCs w:val="16"/>
               </w:rPr>
@@ -3575,7 +3475,7 @@
             </w:pPr>
             <w:r>
               <w:rPr>
-                <w:rFonts w:ascii="Arial" w:eastAsia="游ゴシック" w:hAnsi="Arial"/>
+                <w:rFonts w:ascii="Arial" w:eastAsia="Yu Gothic" w:hAnsi="Arial"/>
                 <w:sz w:val="16"/>
                 <w:szCs w:val="16"/>
               </w:rPr>
@@ -3606,7 +3506,7 @@
             </w:pPr>
             <w:r>
               <w:rPr>
-                <w:rFonts w:ascii="Arial" w:eastAsia="游ゴシック" w:hAnsi="Arial"/>
+                <w:rFonts w:ascii="Arial" w:eastAsia="Yu Gothic" w:hAnsi="Arial"/>
                 <w:sz w:val="16"/>
                 <w:szCs w:val="16"/>
               </w:rPr>
@@ -3641,7 +3541,7 @@
             </w:pPr>
             <w:r>
               <w:rPr>
-                <w:rFonts w:ascii="Arial" w:eastAsia="游ゴシック" w:hAnsi="Arial"/>
+                <w:rFonts w:ascii="Arial" w:eastAsia="Yu Gothic" w:hAnsi="Arial"/>
                 <w:sz w:val="16"/>
                 <w:szCs w:val="16"/>
               </w:rPr>
@@ -3672,7 +3572,7 @@
             </w:pPr>
             <w:r>
               <w:rPr>
-                <w:rFonts w:ascii="Arial" w:eastAsia="游ゴシック" w:hAnsi="Arial"/>
+                <w:rFonts w:ascii="Arial" w:eastAsia="Yu Gothic" w:hAnsi="Arial"/>
                 <w:sz w:val="16"/>
                 <w:szCs w:val="16"/>
               </w:rPr>
@@ -3703,7 +3603,7 @@
             </w:pPr>
             <w:r>
               <w:rPr>
-                <w:rFonts w:ascii="Arial" w:eastAsia="游ゴシック" w:hAnsi="Arial"/>
+                <w:rFonts w:ascii="Arial" w:eastAsia="Yu Gothic" w:hAnsi="Arial"/>
                 <w:sz w:val="16"/>
                 <w:szCs w:val="16"/>
               </w:rPr>
@@ -3738,7 +3638,7 @@
             </w:pPr>
             <w:r>
               <w:rPr>
-                <w:rFonts w:ascii="Arial" w:eastAsia="游ゴシック" w:hAnsi="Arial"/>
+                <w:rFonts w:ascii="Arial" w:eastAsia="Yu Gothic" w:hAnsi="Arial"/>
                 <w:sz w:val="16"/>
                 <w:szCs w:val="16"/>
               </w:rPr>
@@ -3769,7 +3669,7 @@
             </w:pPr>
             <w:r>
               <w:rPr>
-                <w:rFonts w:ascii="Arial" w:eastAsia="游ゴシック" w:hAnsi="Arial"/>
+                <w:rFonts w:ascii="Arial" w:eastAsia="Yu Gothic" w:hAnsi="Arial"/>
                 <w:sz w:val="16"/>
                 <w:szCs w:val="16"/>
               </w:rPr>
@@ -3800,7 +3700,7 @@
             </w:pPr>
             <w:r>
               <w:rPr>
-                <w:rFonts w:ascii="Arial" w:eastAsia="游ゴシック" w:hAnsi="Arial"/>
+                <w:rFonts w:ascii="Arial" w:eastAsia="Yu Gothic" w:hAnsi="Arial"/>
                 <w:sz w:val="16"/>
                 <w:szCs w:val="16"/>
               </w:rPr>
@@ -3835,7 +3735,7 @@
             </w:pPr>
             <w:r>
               <w:rPr>
-                <w:rFonts w:ascii="Arial" w:eastAsia="游ゴシック" w:hAnsi="Arial"/>
+                <w:rFonts w:ascii="Arial" w:eastAsia="Yu Gothic" w:hAnsi="Arial"/>
                 <w:sz w:val="16"/>
                 <w:szCs w:val="16"/>
               </w:rPr>
@@ -3866,7 +3766,7 @@
             </w:pPr>
             <w:r>
               <w:rPr>
-                <w:rFonts w:ascii="Arial" w:eastAsia="游ゴシック" w:hAnsi="Arial"/>
+                <w:rFonts w:ascii="Arial" w:eastAsia="Yu Gothic" w:hAnsi="Arial"/>
                 <w:sz w:val="16"/>
                 <w:szCs w:val="16"/>
               </w:rPr>
@@ -3897,7 +3797,7 @@
             </w:pPr>
             <w:r>
               <w:rPr>
-                <w:rFonts w:ascii="Arial" w:eastAsia="游ゴシック" w:hAnsi="Arial"/>
+                <w:rFonts w:ascii="Arial" w:eastAsia="Yu Gothic" w:hAnsi="Arial"/>
                 <w:sz w:val="16"/>
                 <w:szCs w:val="16"/>
               </w:rPr>
@@ -3932,7 +3832,7 @@
             </w:pPr>
             <w:r>
               <w:rPr>
-                <w:rFonts w:ascii="Arial" w:eastAsia="游ゴシック" w:hAnsi="Arial"/>
+                <w:rFonts w:ascii="Arial" w:eastAsia="Yu Gothic" w:hAnsi="Arial"/>
                 <w:sz w:val="16"/>
                 <w:szCs w:val="16"/>
               </w:rPr>
@@ -3963,7 +3863,7 @@
             </w:pPr>
             <w:r>
               <w:rPr>
-                <w:rFonts w:ascii="Arial" w:eastAsia="游ゴシック" w:hAnsi="Arial"/>
+                <w:rFonts w:ascii="Arial" w:eastAsia="Yu Gothic" w:hAnsi="Arial"/>
                 <w:sz w:val="16"/>
                 <w:szCs w:val="16"/>
               </w:rPr>
@@ -3994,7 +3894,7 @@
             </w:pPr>
             <w:r>
               <w:rPr>
-                <w:rFonts w:ascii="Arial" w:eastAsia="游ゴシック" w:hAnsi="Arial"/>
+                <w:rFonts w:ascii="Arial" w:eastAsia="Yu Gothic" w:hAnsi="Arial"/>
                 <w:sz w:val="16"/>
                 <w:szCs w:val="16"/>
               </w:rPr>
@@ -4029,7 +3929,7 @@
             </w:pPr>
             <w:r>
               <w:rPr>
-                <w:rFonts w:ascii="Arial" w:eastAsia="游ゴシック" w:hAnsi="Arial"/>
+                <w:rFonts w:ascii="Arial" w:eastAsia="Yu Gothic" w:hAnsi="Arial"/>
                 <w:sz w:val="16"/>
                 <w:szCs w:val="16"/>
               </w:rPr>
@@ -4060,7 +3960,7 @@
             </w:pPr>
             <w:r>
               <w:rPr>
-                <w:rFonts w:ascii="Arial" w:eastAsia="游ゴシック" w:hAnsi="Arial"/>
+                <w:rFonts w:ascii="Arial" w:eastAsia="Yu Gothic" w:hAnsi="Arial"/>
                 <w:sz w:val="16"/>
                 <w:szCs w:val="16"/>
               </w:rPr>
@@ -4091,7 +3991,7 @@
             </w:pPr>
             <w:r>
               <w:rPr>
-                <w:rFonts w:ascii="Arial" w:eastAsia="游ゴシック" w:hAnsi="Arial"/>
+                <w:rFonts w:ascii="Arial" w:eastAsia="Yu Gothic" w:hAnsi="Arial"/>
                 <w:sz w:val="16"/>
                 <w:szCs w:val="16"/>
               </w:rPr>
@@ -4107,7 +4007,7 @@
       </w:pPr>
       <w:r>
         <w:rPr>
-          <w:rFonts w:ascii="Arial" w:eastAsia="游ゴシック" w:hAnsi="Arial"/>
+          <w:rFonts w:ascii="Arial" w:eastAsia="Yu Gothic" w:hAnsi="Arial"/>
           <w:b/>
           <w:bCs/>
           <w:sz w:val="16"/>
@@ -4117,7 +4017,7 @@
       </w:r>
       <w:r>
         <w:rPr>
-          <w:rFonts w:ascii="Arial" w:eastAsia="游ゴシック" w:hAnsi="Arial"/>
+          <w:rFonts w:ascii="Arial" w:eastAsia="Yu Gothic" w:hAnsi="Arial"/>
           <w:color w:val="5B6570"/>
           <w:sz w:val="16"/>
           <w:szCs w:val="16"/>
@@ -4278,6 +4178,7 @@
           <w:b/>
           <w:bCs/>
         </w:rPr>
+        <w:lastRenderedPageBreak/>
         <w:t xml:space="preserve">Fine-tuning with automatic labelling. </w:t>
       </w:r>
       <w:r>
@@ -4650,7 +4551,7 @@
     </w:pPr>
     <w:r>
       <w:rPr>
-        <w:rFonts w:ascii="Arial" w:eastAsia="游ゴシック" w:hAnsi="Arial"/>
+        <w:rFonts w:ascii="Arial" w:eastAsia="Yu Gothic" w:hAnsi="Arial"/>
         <w:color w:val="5B6570"/>
         <w:sz w:val="16"/>
         <w:szCs w:val="16"/>
@@ -4659,7 +4560,7 @@
     </w:r>
     <w:r>
       <w:rPr>
-        <w:rFonts w:ascii="Arial" w:eastAsia="游ゴシック" w:hAnsi="Arial"/>
+        <w:rFonts w:ascii="Arial" w:eastAsia="Yu Gothic" w:hAnsi="Arial"/>
         <w:color w:val="5B6570"/>
         <w:sz w:val="16"/>
         <w:szCs w:val="16"/>
@@ -4668,7 +4569,7 @@
     </w:r>
     <w:r>
       <w:rPr>
-        <w:rFonts w:ascii="Arial" w:eastAsia="游ゴシック" w:hAnsi="Arial"/>
+        <w:rFonts w:ascii="Arial" w:eastAsia="Yu Gothic" w:hAnsi="Arial"/>
         <w:color w:val="5B6570"/>
         <w:sz w:val="16"/>
         <w:szCs w:val="16"/>
@@ -4677,7 +4578,7 @@
     </w:r>
     <w:r>
       <w:rPr>
-        <w:rFonts w:ascii="Arial" w:eastAsia="游ゴシック" w:hAnsi="Arial"/>
+        <w:rFonts w:ascii="Arial" w:eastAsia="Yu Gothic" w:hAnsi="Arial"/>
         <w:noProof/>
         <w:color w:val="5B6570"/>
         <w:sz w:val="16"/>
@@ -4687,7 +4588,7 @@
     </w:r>
     <w:r>
       <w:rPr>
-        <w:rFonts w:ascii="Arial" w:eastAsia="游ゴシック" w:hAnsi="Arial"/>
+        <w:rFonts w:ascii="Arial" w:eastAsia="Yu Gothic" w:hAnsi="Arial"/>
         <w:color w:val="5B6570"/>
         <w:sz w:val="16"/>
         <w:szCs w:val="16"/>
@@ -5350,7 +5251,7 @@
       <w:outlineLvl w:val="0"/>
     </w:pPr>
     <w:rPr>
-      <w:rFonts w:ascii="Arial" w:eastAsia="游ゴシック" w:hAnsi="Arial"/>
+      <w:rFonts w:ascii="Arial" w:eastAsia="Yu Gothic" w:hAnsi="Arial"/>
       <w:b/>
       <w:bCs/>
       <w:color w:val="1D232A"/>
@@ -5370,7 +5271,7 @@
       <w:outlineLvl w:val="1"/>
     </w:pPr>
     <w:rPr>
-      <w:rFonts w:ascii="Arial" w:eastAsia="游ゴシック" w:hAnsi="Arial"/>
+      <w:rFonts w:ascii="Arial" w:eastAsia="Yu Gothic" w:hAnsi="Arial"/>
       <w:b/>
       <w:bCs/>
       <w:color w:val="1D232A"/>
@@ -5570,7 +5471,7 @@
     <w:uiPriority w:val="10"/>
     <w:qFormat/>
     <w:rPr>
-      <w:rFonts w:ascii="Arial" w:eastAsia="游ゴシック" w:hAnsi="Arial"/>
+      <w:rFonts w:ascii="Arial" w:eastAsia="Yu Gothic" w:hAnsi="Arial"/>
       <w:b/>
       <w:bCs/>
       <w:color w:val="1D232A"/>

</xml_diff>